<commit_message>
align docs with current physical model baseline
</commit_message>
<xml_diff>
--- a/PFC.docx
+++ b/PFC.docx
@@ -38,6 +38,472 @@
       </w:r>
     </w:p>
     <w:p>
+      <w:r>
+        <w:rPr>
+          <w:b/>
+          <w:bCs/>
+        </w:rPr>
+        <w:t># Coupling Contract</w:t>
+      </w:r>
+    </w:p>
+    <w:p/>
+    <w:p>
+      <w:r>
+        <w:rPr>
+          <w:b/>
+          <w:bCs/>
+        </w:rPr>
+        <w:t>## General principle</w:t>
+      </w:r>
+    </w:p>
+    <w:p>
+      <w:r>
+        <w:t>PFC2D represents the particle-scale structure of the underground mine waste-rock pile.</w:t>
+      </w:r>
+    </w:p>
+    <w:p>
+      <w:r>
+        <w:t>FiPy represents the engineering-scale continuum field used to describe slurry transport.</w:t>
+      </w:r>
+    </w:p>
+    <w:p/>
+    <w:p>
+      <w:r>
+        <w:rPr>
+          <w:b/>
+          <w:bCs/>
+        </w:rPr>
+        <w:t>## Core idea</w:t>
+      </w:r>
+    </w:p>
+    <w:p>
+      <w:r>
+        <w:t>The rainfall infiltration 2D reference case is not reused for its rainfall physics.</w:t>
+      </w:r>
+    </w:p>
+    <w:p>
+      <w:r>
+        <w:t>It is reused for its PFC2D-FiPy data-exchange workflow.</w:t>
+      </w:r>
+    </w:p>
+    <w:p/>
+    <w:p>
+      <w:r>
+        <w:rPr>
+          <w:b/>
+          <w:bCs/>
+        </w:rPr>
+        <w:t>## What is preserved vs. what is replaced</w:t>
+      </w:r>
+    </w:p>
+    <w:p/>
+    <w:p>
+      <w:r>
+        <w:rPr>
+          <w:b/>
+          <w:bCs/>
+        </w:rPr>
+        <w:t>### Preserved from the reference case</w:t>
+      </w:r>
+    </w:p>
+    <w:p>
+      <w:r>
+        <w:t>- PFC2D -&gt; FiPy -&gt; PFC2D exchange order</w:t>
+      </w:r>
+    </w:p>
+    <w:p>
+      <w:r>
+        <w:t>- continuum-field interpolation back to particles</w:t>
+      </w:r>
+    </w:p>
+    <w:p>
+      <w:r>
+        <w:t>- explicit coupling-cycle structure</w:t>
+      </w:r>
+    </w:p>
+    <w:p>
+      <w:r>
+        <w:t>- separation between reference workflow and new development</w:t>
+      </w:r>
+    </w:p>
+    <w:p/>
+    <w:p>
+      <w:r>
+        <w:rPr>
+          <w:b/>
+          <w:bCs/>
+        </w:rPr>
+        <w:t>### Replaced for the new project</w:t>
+      </w:r>
+    </w:p>
+    <w:p>
+      <w:r>
+        <w:t>- VG-model interpretation</w:t>
+      </w:r>
+    </w:p>
+    <w:p>
+      <w:r>
+        <w:t>- Richards-equation soil-water meaning</w:t>
+      </w:r>
+    </w:p>
+    <w:p>
+      <w:r>
+        <w:t>- rainfall-infiltration boundary condition</w:t>
+      </w:r>
+    </w:p>
+    <w:p>
+      <w:r>
+        <w:t>- soil-column physical setting</w:t>
+      </w:r>
+    </w:p>
+    <w:p>
+      <w:r>
+        <w:t>- reference hydraulic parameters</w:t>
+      </w:r>
+    </w:p>
+    <w:p/>
+    <w:p>
+      <w:r>
+        <w:rPr>
+          <w:b/>
+          <w:bCs/>
+        </w:rPr>
+        <w:t>## Coupling workflow</w:t>
+      </w:r>
+    </w:p>
+    <w:p>
+      <w:r>
+        <w:t>One coupling cycle is defined as:</w:t>
+      </w:r>
+    </w:p>
+    <w:p/>
+    <w:p>
+      <w:r>
+        <w:t>1. Build or restore the waste-rock structure in PFC2D.</w:t>
+      </w:r>
+    </w:p>
+    <w:p>
+      <w:r>
+        <w:t>2. Extract required structural or geometric information from PFC2D.</w:t>
+      </w:r>
+    </w:p>
+    <w:p>
+      <w:r>
+        <w:t>3. Build or update the FiPy mesh and field variables.</w:t>
+      </w:r>
+    </w:p>
+    <w:p>
+      <w:r>
+        <w:t>4. Solve one or more FiPy continuum transport steps.</w:t>
+      </w:r>
+    </w:p>
+    <w:p>
+      <w:r>
+        <w:t>5. Map FiPy field values back to PFC2D particles.</w:t>
+      </w:r>
+    </w:p>
+    <w:p>
+      <w:r>
+        <w:t>6. Update particle-side state if required.</w:t>
+      </w:r>
+    </w:p>
+    <w:p>
+      <w:r>
+        <w:t>7. Continue to the next coupling cycle.</w:t>
+      </w:r>
+    </w:p>
+    <w:p/>
+    <w:p>
+      <w:r>
+        <w:rPr>
+          <w:b/>
+          <w:bCs/>
+        </w:rPr>
+        <w:t>## PFC2D -&gt; FiPy</w:t>
+      </w:r>
+    </w:p>
+    <w:p>
+      <w:r>
+        <w:lastRenderedPageBreak/>
+        <w:t>Potential quantities exchanged from PFC2D to FiPy include:</w:t>
+      </w:r>
+    </w:p>
+    <w:p>
+      <w:r>
+        <w:t>- domain geometry</w:t>
+      </w:r>
+    </w:p>
+    <w:p>
+      <w:r>
+        <w:t>- waste-rock pile shape</w:t>
+      </w:r>
+    </w:p>
+    <w:p>
+      <w:r>
+        <w:t>- porosity or void-related information</w:t>
+      </w:r>
+    </w:p>
+    <w:p>
+      <w:r>
+        <w:t>- particle spatial distribution</w:t>
+      </w:r>
+    </w:p>
+    <w:p>
+      <w:r>
+        <w:t>- boundary location</w:t>
+      </w:r>
+    </w:p>
+    <w:p>
+      <w:r>
+        <w:t>- internal structural state if needed later</w:t>
+      </w:r>
+    </w:p>
+    <w:p/>
+    <w:p>
+      <w:r>
+        <w:rPr>
+          <w:b/>
+          <w:bCs/>
+        </w:rPr>
+        <w:t>## FiPy -&gt; PFC2D</w:t>
+      </w:r>
+    </w:p>
+    <w:p>
+      <w:r>
+        <w:t>Potential quantities exchanged from FiPy to PFC2D include:</w:t>
+      </w:r>
+    </w:p>
+    <w:p>
+      <w:r>
+        <w:t>- pressure-like field</w:t>
+      </w:r>
+    </w:p>
+    <w:p>
+      <w:r>
+        <w:t>- hydraulic head-like field if that form is still used</w:t>
+      </w:r>
+    </w:p>
+    <w:p>
+      <w:r>
+        <w:t>- flux / velocity field</w:t>
+      </w:r>
+    </w:p>
+    <w:p>
+      <w:r>
+        <w:t>- local slurry occupancy / filling indicator</w:t>
+      </w:r>
+    </w:p>
+    <w:p>
+      <w:r>
+        <w:t>- local deposition / clogging indicator if introduced later</w:t>
+      </w:r>
+    </w:p>
+    <w:p/>
+    <w:p>
+      <w:r>
+        <w:rPr>
+          <w:b/>
+          <w:bCs/>
+        </w:rPr>
+        <w:t>## Current placeholder pouring boundary</w:t>
+      </w:r>
+    </w:p>
+    <w:p>
+      <w:r>
+        <w:t>For the current validated coupling stage, the FiPy inlet boundary is kept simple:</w:t>
+      </w:r>
+    </w:p>
+    <w:p>
+      <w:r>
+        <w:t>- top boundary inlet patch centered at `inlet_center_x`</w:t>
+      </w:r>
+    </w:p>
+    <w:p>
+      <w:r>
+        <w:t>- inlet half-width in x as `inlet_half_width_x`</w:t>
+      </w:r>
+    </w:p>
+    <w:p>
+      <w:r>
+        <w:t>- fixed inlet pressure value as `inlet_pressure_value`</w:t>
+      </w:r>
+    </w:p>
+    <w:p/>
+    <w:p>
+      <w:r>
+        <w:t>This boundary is an engineering placeholder only and does not represent a final constitutive inflow model.</w:t>
+      </w:r>
+    </w:p>
+    <w:p/>
+    <w:p>
+      <w:r>
+        <w:rPr>
+          <w:b/>
+          <w:bCs/>
+        </w:rPr>
+        <w:t>## Mapping rule</w:t>
+      </w:r>
+    </w:p>
+    <w:p>
+      <w:r>
+        <w:t>Continuum field variables computed on the FiPy mesh are mapped back to particles in PFC2D by interpolation.</w:t>
+      </w:r>
+    </w:p>
+    <w:p>
+      <w:r>
+        <w:t>The current reference implementation follows the rainfall infiltration case, where field values are interpolated and written back to particle extra variables.</w:t>
+      </w:r>
+    </w:p>
+    <w:p/>
+    <w:p>
+      <w:r>
+        <w:rPr>
+          <w:b/>
+          <w:bCs/>
+        </w:rPr>
+        <w:t>## Execution rule</w:t>
+      </w:r>
+    </w:p>
+    <w:p>
+      <w:r>
+        <w:t>The exchange sequence should remain consistent with the reference case until the new slurry-transport framework is stable.</w:t>
+      </w:r>
+    </w:p>
+    <w:p>
+      <w:r>
+        <w:t>The physical interpretation of variables may change, but the data-exchange order should remain explicit and traceable.</w:t>
+      </w:r>
+    </w:p>
+    <w:p/>
+    <w:p>
+      <w:r>
+        <w:rPr>
+          <w:b/>
+          <w:bCs/>
+        </w:rPr>
+        <w:t>## Development rule</w:t>
+      </w:r>
+    </w:p>
+    <w:p>
+      <w:r>
+        <w:t>Reference-case code under `reference_cases/` is for workflow reference only.</w:t>
+      </w:r>
+    </w:p>
+    <w:p>
+      <w:r>
+        <w:t>New maintainable implementation should be developed under `src/`.</w:t>
+      </w:r>
+    </w:p>
+    <w:p/>
+    <w:p>
+      <w:r>
+        <w:rPr>
+          <w:b/>
+          <w:bCs/>
+        </w:rPr>
+        <w:t>## Near-term development target</w:t>
+      </w:r>
+    </w:p>
+    <w:p>
+      <w:r>
+        <w:t>The first development target is to reproduce the same exchange structure as the rainfall infiltration reference case for the new waste-rock slurry-filling scenario.</w:t>
+      </w:r>
+    </w:p>
+    <w:p/>
+    <w:p>
+      <w:r>
+        <w:rPr>
+          <w:b/>
+          <w:bCs/>
+        </w:rPr>
+        <w:t>## Important note</w:t>
+      </w:r>
+    </w:p>
+    <w:p>
+      <w:r>
+        <w:t>At the current stage, priority is given to:</w:t>
+      </w:r>
+    </w:p>
+    <w:p>
+      <w:r>
+        <w:t>- preserving data-exchange logic</w:t>
+      </w:r>
+    </w:p>
+    <w:p>
+      <w:r>
+        <w:t>- keeping execution order clear</w:t>
+      </w:r>
+    </w:p>
+    <w:p>
+      <w:r>
+        <w:t>- separating reference cases from new development</w:t>
+      </w:r>
+    </w:p>
+    <w:p>
+      <w:r>
+        <w:t>- replacing physics gradually rather than rewriting everything at once</w:t>
+      </w:r>
+    </w:p>
+    <w:p/>
+    <w:p>
+      <w:r>
+        <w:rPr>
+          <w:b/>
+          <w:bCs/>
+        </w:rPr>
+        <w:t>## Current fixed coupling assumptions</w:t>
+      </w:r>
+    </w:p>
+    <w:p/>
+    <w:p>
+      <w:r>
+        <w:t>The current coupling workflow uses the following fixed assumptions:</w:t>
+      </w:r>
+    </w:p>
+    <w:p/>
+    <w:p>
+      <w:r>
+        <w:t>- PFC provides structural information only at initialization.</w:t>
+      </w:r>
+    </w:p>
+    <w:p>
+      <w:r>
+        <w:t>- Porosity is read once and used to initialize FiPy permeability / mobility.</w:t>
+      </w:r>
+    </w:p>
+    <w:p>
+      <w:r>
+        <w:t>- No later coupling step updates porosity from PFC.</w:t>
+      </w:r>
+    </w:p>
+    <w:p>
+      <w:r>
+        <w:t>- The particle skeleton is fixed during flow and does not respond mechanically to fluid action.</w:t>
+      </w:r>
+    </w:p>
+    <w:p>
+      <w:r>
+        <w:t>- Flow-related results are mapped back to particle extra values only.</w:t>
+      </w:r>
+    </w:p>
+    <w:p>
+      <w:r>
+        <w:t>- No fluid-force feedback is applied to the waste-rock skeleton.</w:t>
+      </w:r>
+    </w:p>
+    <w:p>
+      <w:r>
+        <w:t>- The particle model is treated as fixed, so no automatic geometry adaptation is included.</w:t>
+      </w:r>
+    </w:p>
+    <w:p>
+      <w:pPr>
+        <w:rPr>
+          <w:rFonts w:hint="eastAsia"/>
+        </w:rPr>
+      </w:pPr>
+    </w:p>
+    <w:p>
       <w:pPr>
         <w:pStyle w:val="3"/>
       </w:pPr>
@@ -49,11 +515,534 @@
       </w:r>
     </w:p>
     <w:p>
+      <w:r>
+        <w:rPr>
+          <w:b/>
+          <w:bCs/>
+        </w:rPr>
+        <w:t># Physical Model and Current Assumptions</w:t>
+      </w:r>
+    </w:p>
+    <w:p/>
+    <w:p>
+      <w:r>
+        <w:rPr>
+          <w:b/>
+          <w:bCs/>
+        </w:rPr>
+        <w:t>## 1. Problem statement</w:t>
+      </w:r>
+    </w:p>
+    <w:p/>
+    <w:p>
+      <w:r>
+        <w:t>This project studies slurry pouring and migration through a waste-rock pile in an underground mine backfilling / grouting context.</w:t>
+      </w:r>
+    </w:p>
+    <w:p/>
+    <w:p>
+      <w:r>
+        <w:t>The final objective is not to directly reproduce a rainfall infiltration case, but to build a dedicated slurry-transport model on a fixed waste-rock skeleton:</w:t>
+      </w:r>
+    </w:p>
+    <w:p/>
+    <w:p>
+      <w:r>
+        <w:t>- PFC2D provides waste-rock structure and porosity-related information.</w:t>
+      </w:r>
+    </w:p>
+    <w:p>
+      <w:r>
+        <w:t>- FiPy solves the continuum-scale fluid field.</w:t>
+      </w:r>
+    </w:p>
+    <w:p>
+      <w:r>
+        <w:t>- Fluid results may be mapped back to particle extra variables for visualization and statistics.</w:t>
+      </w:r>
+    </w:p>
+    <w:p/>
+    <w:p>
+      <w:r>
+        <w:rPr>
+          <w:b/>
+          <w:bCs/>
+        </w:rPr>
+        <w:t>## 2. Modeling level</w:t>
+      </w:r>
+    </w:p>
+    <w:p/>
+    <w:p>
+      <w:r>
+        <w:t>The current model is formulated at the continuum scale of a porous medium.</w:t>
+      </w:r>
+    </w:p>
+    <w:p/>
+    <w:p>
+      <w:r>
+        <w:t>This means:</w:t>
+      </w:r>
+    </w:p>
+    <w:p/>
+    <w:p>
+      <w:r>
+        <w:t>- flow is not solved at the explicit pore-channel scale,</w:t>
+      </w:r>
+    </w:p>
+    <w:p>
+      <w:r>
+        <w:lastRenderedPageBreak/>
+        <w:t>- the waste-rock pile is represented as an equivalent porous medium,</w:t>
+      </w:r>
+    </w:p>
+    <w:p>
+      <w:r>
+        <w:t>- pressure / filling-related field variables are solved on a FiPy mesh.</w:t>
+      </w:r>
+    </w:p>
+    <w:p/>
+    <w:p>
+      <w:r>
+        <w:t>Therefore, the current approach is a Darcy-type continuum formulation, not a direct pore-scale Navier–Stokes CFD model.</w:t>
+      </w:r>
+    </w:p>
+    <w:p/>
+    <w:p>
+      <w:r>
+        <w:rPr>
+          <w:b/>
+          <w:bCs/>
+        </w:rPr>
+        <w:t>## 3. Saturation state</w:t>
+      </w:r>
+    </w:p>
+    <w:p/>
+    <w:p>
+      <w:r>
+        <w:t>The slurry transport process is treated as a variable-saturation process rather than a fully saturated seepage problem.</w:t>
+      </w:r>
+    </w:p>
+    <w:p/>
+    <w:p>
+      <w:r>
+        <w:t>Reason:</w:t>
+      </w:r>
+    </w:p>
+    <w:p/>
+    <w:p>
+      <w:r>
+        <w:t>- slurry is poured locally from the top,</w:t>
+      </w:r>
+    </w:p>
+    <w:p>
+      <w:r>
+        <w:t>- the waste-rock void space is not fully occupied by slurry at the beginning,</w:t>
+      </w:r>
+    </w:p>
+    <w:p>
+      <w:r>
+        <w:t>- slurry progressively occupies pore volume during migration.</w:t>
+      </w:r>
+    </w:p>
+    <w:p/>
+    <w:p>
+      <w:r>
+        <w:t>So the model should not be interpreted as a classical fully saturated Darcy seepage model.</w:t>
+      </w:r>
+    </w:p>
+    <w:p/>
+    <w:p>
+      <w:r>
+        <w:rPr>
+          <w:b/>
+          <w:bCs/>
+        </w:rPr>
+        <w:t>## 4. Governing conceptual framework</w:t>
+      </w:r>
+    </w:p>
+    <w:p/>
+    <w:p>
+      <w:r>
+        <w:t>The current working framework is:</w:t>
+      </w:r>
+    </w:p>
+    <w:p/>
+    <w:p>
+      <w:r>
+        <w:t>- generalized Darcy-type continuum transport,</w:t>
+      </w:r>
+    </w:p>
+    <w:p>
+      <w:r>
+        <w:t>- variable saturation / pore occupation during slurry migration,</w:t>
+      </w:r>
+    </w:p>
+    <w:p>
+      <w:r>
+        <w:t>- nonlinear constitutive behavior,</w:t>
+      </w:r>
+    </w:p>
+    <w:p>
+      <w:r>
+        <w:t>- possible Bingham-type yield effect in slurry rheology.</w:t>
+      </w:r>
+    </w:p>
+    <w:p/>
+    <w:p>
+      <w:r>
+        <w:t>In other words, this project does not assume a simple linear saturated Darcy law with constant mobility.</w:t>
+      </w:r>
+    </w:p>
+    <w:p/>
+    <w:p>
+      <w:r>
+        <w:t>Instead, the effective mobility may depend on:</w:t>
+      </w:r>
+    </w:p>
+    <w:p/>
+    <w:p>
+      <w:r>
+        <w:t>- porosity,</w:t>
+      </w:r>
+    </w:p>
+    <w:p>
+      <w:r>
+        <w:t>- local filling / saturation state,</w:t>
+      </w:r>
+    </w:p>
+    <w:p>
+      <w:r>
+        <w:t>- slurry rheology,</w:t>
+      </w:r>
+    </w:p>
+    <w:p>
+      <w:r>
+        <w:t>- local driving gradient.</w:t>
+      </w:r>
+    </w:p>
+    <w:p/>
+    <w:p>
+      <w:r>
+        <w:rPr>
+          <w:b/>
+          <w:bCs/>
+        </w:rPr>
+        <w:t>## 5. Current physical assumptions</w:t>
+      </w:r>
+    </w:p>
+    <w:p/>
+    <w:p>
+      <w:r>
+        <w:rPr>
+          <w:b/>
+          <w:bCs/>
+        </w:rPr>
+        <w:t>### 5.1 Fixed solid skeleton</w:t>
+      </w:r>
+    </w:p>
+    <w:p/>
+    <w:p>
+      <w:r>
+        <w:t>The waste-rock skeleton is fixed.</w:t>
+      </w:r>
+    </w:p>
+    <w:p/>
+    <w:p>
+      <w:r>
+        <w:t>Fluid flow does not induce particle displacement or skeleton deformation in the current version.</w:t>
+      </w:r>
+    </w:p>
+    <w:p/>
+    <w:p>
+      <w:r>
+        <w:rPr>
+          <w:b/>
+          <w:bCs/>
+        </w:rPr>
+        <w:t>### 5.2 One-time porosity transfer</w:t>
+      </w:r>
+    </w:p>
+    <w:p/>
+    <w:p>
+      <w:r>
+        <w:t>Porosity information is transferred from PFC to FiPy only once during initialization.</w:t>
+      </w:r>
+    </w:p>
+    <w:p/>
+    <w:p>
+      <w:r>
+        <w:t>Later flow steps do not update porosity dynamically.</w:t>
+      </w:r>
+    </w:p>
+    <w:p/>
+    <w:p>
+      <w:r>
+        <w:rPr>
+          <w:b/>
+          <w:bCs/>
+        </w:rPr>
+        <w:t>### 5.3 Variable-saturation slurry migration</w:t>
+      </w:r>
+    </w:p>
+    <w:p/>
+    <w:p>
+      <w:r>
+        <w:t>The slurry migration process is treated as a variable-saturation process.</w:t>
+      </w:r>
+    </w:p>
+    <w:p/>
+    <w:p>
+      <w:r>
+        <w:t>The slurry progressively occupies the available pore space, rather than assuming that the entire domain is fully saturated from the start.</w:t>
+      </w:r>
+    </w:p>
+    <w:p/>
+    <w:p>
+      <w:r>
+        <w:rPr>
+          <w:b/>
+          <w:bCs/>
+        </w:rPr>
+        <w:t>### 5.4 Bingham-type slurry behavior</w:t>
+      </w:r>
+    </w:p>
+    <w:p/>
+    <w:p>
+      <w:r>
+        <w:t>The first version should consider the slurry as a Bingham-type material at the conceptual level.</w:t>
+      </w:r>
+    </w:p>
+    <w:p/>
+    <w:p>
+      <w:r>
+        <w:t>This means the constitutive relation should allow yield-controlled flow behavior rather than treating slurry as ordinary Newtonian water.</w:t>
+      </w:r>
+    </w:p>
+    <w:p/>
+    <w:p>
+      <w:r>
+        <w:rPr>
+          <w:b/>
+          <w:bCs/>
+        </w:rPr>
+        <w:t>### 5.5 Clogging neglected in the first version</w:t>
+      </w:r>
+    </w:p>
+    <w:p/>
+    <w:p>
+      <w:r>
+        <w:t>Because the waste-rock structure is relatively coarse, clogging is not treated as a dominant mechanism in the current first version.</w:t>
+      </w:r>
+    </w:p>
+    <w:p/>
+    <w:p>
+      <w:r>
+        <w:t>This simplification may be revisited later if simulation results or experiments indicate otherwise.</w:t>
+      </w:r>
+    </w:p>
+    <w:p/>
+    <w:p>
+      <w:r>
+        <w:rPr>
+          <w:b/>
+          <w:bCs/>
+        </w:rPr>
+        <w:t>## 6. What is intentionally excluded for now</w:t>
+      </w:r>
+    </w:p>
+    <w:p/>
+    <w:p>
+      <w:r>
+        <w:t>The current first version does not include:</w:t>
+      </w:r>
+    </w:p>
+    <w:p/>
+    <w:p>
+      <w:r>
+        <w:t>- skeleton deformation caused by fluid,</w:t>
+      </w:r>
+    </w:p>
+    <w:p>
+      <w:r>
+        <w:t>- dynamic porosity update,</w:t>
+      </w:r>
+    </w:p>
+    <w:p>
+      <w:r>
+        <w:t>- clogging-feedback-controlled permeability reduction,</w:t>
+      </w:r>
+    </w:p>
+    <w:p>
+      <w:r>
+        <w:t>- explicit pore-scale flow resolution,</w:t>
+      </w:r>
+    </w:p>
+    <w:p>
+      <w:r>
+        <w:t>- direct adoption of the standard Richards–van Genuchten soil-water formulation.</w:t>
+      </w:r>
+    </w:p>
+    <w:p/>
+    <w:p>
+      <w:r>
+        <w:rPr>
+          <w:b/>
+          <w:bCs/>
+        </w:rPr>
+        <w:t>## 7. Implications for code design</w:t>
+      </w:r>
+    </w:p>
+    <w:p/>
+    <w:p>
+      <w:r>
+        <w:t>The code should follow these constraints:</w:t>
+      </w:r>
+    </w:p>
+    <w:p/>
+    <w:p>
+      <w:r>
+        <w:t>- keep the PFC side focused on geometry / porosity export,</w:t>
+      </w:r>
+    </w:p>
+    <w:p>
+      <w:r>
+        <w:t>- keep the FiPy side focused on continuum field solving,</w:t>
+      </w:r>
+    </w:p>
+    <w:p>
+      <w:r>
+        <w:t>- avoid introducing assumptions specific to classical saturated water infiltration without explicit justification,</w:t>
+      </w:r>
+    </w:p>
+    <w:p>
+      <w:r>
+        <w:t>- preserve extension points for later upgrades such as clogging, dynamic porosity, or more advanced rheology.</w:t>
+      </w:r>
+    </w:p>
+    <w:p/>
+    <w:p>
+      <w:r>
+        <w:rPr>
+          <w:b/>
+          <w:bCs/>
+        </w:rPr>
+        <w:t>## 8. Terminology used in the repository</w:t>
+      </w:r>
+    </w:p>
+    <w:p/>
+    <w:p>
+      <w:r>
+        <w:t xml:space="preserve">- </w:t>
+      </w:r>
+      <w:r>
+        <w:rPr>
+          <w:b/>
+          <w:bCs/>
+        </w:rPr>
+        <w:t>**porosity**</w:t>
+      </w:r>
+      <w:r>
+        <w:t>: pore volume fraction provided by PFC at initialization</w:t>
+      </w:r>
+    </w:p>
+    <w:p>
+      <w:r>
+        <w:t xml:space="preserve">- </w:t>
+      </w:r>
+      <w:r>
+        <w:rPr>
+          <w:b/>
+          <w:bCs/>
+        </w:rPr>
+        <w:t>**filling**</w:t>
+      </w:r>
+      <w:r>
+        <w:t>: fraction of pore space occupied by slurry in a control volume</w:t>
+      </w:r>
+    </w:p>
+    <w:p>
+      <w:r>
+        <w:t xml:space="preserve">- </w:t>
+      </w:r>
+      <w:r>
+        <w:rPr>
+          <w:b/>
+          <w:bCs/>
+        </w:rPr>
+        <w:t>**mobility**</w:t>
+      </w:r>
+      <w:r>
+        <w:t>: effective flow capacity in the generalized Darcy-type model</w:t>
+      </w:r>
+    </w:p>
+    <w:p>
+      <w:r>
+        <w:t xml:space="preserve">- </w:t>
+      </w:r>
+      <w:r>
+        <w:rPr>
+          <w:b/>
+          <w:bCs/>
+        </w:rPr>
+        <w:t>**pressure**</w:t>
+      </w:r>
+      <w:r>
+        <w:t>: continuum driving variable used in FiPy solving</w:t>
+      </w:r>
+    </w:p>
+    <w:p>
+      <w:r>
+        <w:t xml:space="preserve">- </w:t>
+      </w:r>
+      <w:r>
+        <w:rPr>
+          <w:b/>
+          <w:bCs/>
+        </w:rPr>
+        <w:t>**clogging**</w:t>
+      </w:r>
+      <w:r>
+        <w:t>: currently disabled first-version mechanism, reserved for future extension</w:t>
+      </w:r>
+    </w:p>
+    <w:p/>
+    <w:p>
+      <w:r>
+        <w:rPr>
+          <w:b/>
+          <w:bCs/>
+        </w:rPr>
+        <w:t>## 9. Status of this document</w:t>
+      </w:r>
+    </w:p>
+    <w:p/>
+    <w:p>
+      <w:r>
+        <w:t>This document describes the current working assumptions of the repository.</w:t>
+      </w:r>
+    </w:p>
+    <w:p/>
+    <w:p>
+      <w:r>
+        <w:t>It is a design baseline for implementation, not a final claim that the physical model is complete.</w:t>
+      </w:r>
+    </w:p>
+    <w:p/>
+    <w:p>
+      <w:r>
+        <w:t>The assumptions may be revised after numerical tests, benchmark comparisons, or experimental validation.</w:t>
+      </w:r>
+    </w:p>
+    <w:p>
+      <w:pPr>
+        <w:rPr>
+          <w:rFonts w:hint="eastAsia"/>
+        </w:rPr>
+      </w:pPr>
+    </w:p>
+    <w:p>
       <w:pPr>
         <w:pStyle w:val="3"/>
-        <w:rPr>
-          <w:rFonts w:hint="eastAsia"/>
-        </w:rPr>
       </w:pPr>
       <w:r>
         <w:rPr>
@@ -61,6 +1050,411 @@
         </w:rPr>
         <w:t>problem_definition.md</w:t>
       </w:r>
+    </w:p>
+    <w:p>
+      <w:r>
+        <w:rPr>
+          <w:b/>
+          <w:bCs/>
+        </w:rPr>
+        <w:t># Problem Definition</w:t>
+      </w:r>
+    </w:p>
+    <w:p/>
+    <w:p>
+      <w:r>
+        <w:rPr>
+          <w:b/>
+          <w:bCs/>
+        </w:rPr>
+        <w:t>## Project</w:t>
+      </w:r>
+    </w:p>
+    <w:p>
+      <w:r>
+        <w:t>Engineering-scale simulation of slurry grouting / filling in underground mine waste rock using PFC2D + FiPy coupling.</w:t>
+      </w:r>
+    </w:p>
+    <w:p/>
+    <w:p>
+      <w:r>
+        <w:rPr>
+          <w:b/>
+          <w:bCs/>
+        </w:rPr>
+        <w:t>## Physical scenario</w:t>
+      </w:r>
+    </w:p>
+    <w:p>
+      <w:r>
+        <w:t>Slurry is poured onto the top surface of a waste-rock pile in an underground mine.</w:t>
+      </w:r>
+    </w:p>
+    <w:p>
+      <w:r>
+        <w:t>The slurry then migrates, infiltrates, and redistributes within the waste-rock mass.</w:t>
+      </w:r>
+    </w:p>
+    <w:p/>
+    <w:p>
+      <w:r>
+        <w:rPr>
+          <w:b/>
+          <w:bCs/>
+        </w:rPr>
+        <w:t>## Current inlet boundary (placeholder)</w:t>
+      </w:r>
+    </w:p>
+    <w:p>
+      <w:r>
+        <w:t>At the current stage, FiPy uses a simple engineering placeholder for slurry pouring:</w:t>
+      </w:r>
+    </w:p>
+    <w:p>
+      <w:r>
+        <w:t>- apply a fixed pressure value on a top-surface inlet patch</w:t>
+      </w:r>
+    </w:p>
+    <w:p>
+      <w:r>
+        <w:t>- define the patch by `inlet_center_x` and `inlet_half_width_x`</w:t>
+      </w:r>
+    </w:p>
+    <w:p>
+      <w:r>
+        <w:lastRenderedPageBreak/>
+        <w:t>- tune inlet intensity by `inlet_pressure_value`</w:t>
+      </w:r>
+    </w:p>
+    <w:p/>
+    <w:p>
+      <w:r>
+        <w:t>This is intentionally a temporary boundary representation to keep coupling validation simple.</w:t>
+      </w:r>
+    </w:p>
+    <w:p/>
+    <w:p>
+      <w:r>
+        <w:rPr>
+          <w:b/>
+          <w:bCs/>
+        </w:rPr>
+        <w:t>## Engineering meaning</w:t>
+      </w:r>
+    </w:p>
+    <w:p>
+      <w:r>
+        <w:t>This model is intended to represent slurry transport behavior in a waste-rock filling process at engineering scale, rather than a small laboratory-scale soil-column rainfall test.</w:t>
+      </w:r>
+    </w:p>
+    <w:p/>
+    <w:p>
+      <w:r>
+        <w:rPr>
+          <w:b/>
+          <w:bCs/>
+        </w:rPr>
+        <w:t>## Modeling goal</w:t>
+      </w:r>
+    </w:p>
+    <w:p>
+      <w:r>
+        <w:t>The goal is to simulate:</w:t>
+      </w:r>
+    </w:p>
+    <w:p>
+      <w:r>
+        <w:t>- slurry migration path</w:t>
+      </w:r>
+    </w:p>
+    <w:p>
+      <w:r>
+        <w:t>- penetration depth</w:t>
+      </w:r>
+    </w:p>
+    <w:p>
+      <w:r>
+        <w:t>- spatial distribution in the waste-rock pile</w:t>
+      </w:r>
+    </w:p>
+    <w:p>
+      <w:r>
+        <w:t>- pressure / flux / filling-related field evolution</w:t>
+      </w:r>
+    </w:p>
+    <w:p/>
+    <w:p>
+      <w:r>
+        <w:rPr>
+          <w:b/>
+          <w:bCs/>
+        </w:rPr>
+        <w:t>## Relation to reference case</w:t>
+      </w:r>
+    </w:p>
+    <w:p>
+      <w:r>
+        <w:t>The rainfall infiltration 2D reference case is used only as a coupling-workflow reference.</w:t>
+      </w:r>
+    </w:p>
+    <w:p>
+      <w:r>
+        <w:t>Its data-exchange logic is reused, but the physical meaning, constitutive model, material parameters, and boundary conditions will be changed for slurry transport in waste rock.</w:t>
+      </w:r>
+    </w:p>
+    <w:p/>
+    <w:p>
+      <w:r>
+        <w:rPr>
+          <w:b/>
+          <w:bCs/>
+        </w:rPr>
+        <w:t>## Modeling note</w:t>
+      </w:r>
+    </w:p>
+    <w:p>
+      <w:r>
+        <w:t>The rainfall infiltration reference case uses a VG-model-based Richards-equation interpretation for unsaturated soil-water flow.</w:t>
+      </w:r>
+    </w:p>
+    <w:p>
+      <w:r>
+        <w:t>That interpretation is not assumed to be directly valid for slurry transport in underground waste rock.</w:t>
+      </w:r>
+    </w:p>
+    <w:p/>
+    <w:p>
+      <w:r>
+        <w:t>In this project, the reference case is reused only for:</w:t>
+      </w:r>
+    </w:p>
+    <w:p>
+      <w:r>
+        <w:t>- coupling workflow</w:t>
+      </w:r>
+    </w:p>
+    <w:p>
+      <w:r>
+        <w:t>- data-exchange order</w:t>
+      </w:r>
+    </w:p>
+    <w:p>
+      <w:r>
+        <w:t>- mesh-field-to-particle mapping logic</w:t>
+      </w:r>
+    </w:p>
+    <w:p/>
+    <w:p>
+      <w:r>
+        <w:t>It is not reused directly for:</w:t>
+      </w:r>
+    </w:p>
+    <w:p>
+      <w:r>
+        <w:t>- constitutive law</w:t>
+      </w:r>
+    </w:p>
+    <w:p>
+      <w:r>
+        <w:t>- hydraulic meaning of variables</w:t>
+      </w:r>
+    </w:p>
+    <w:p>
+      <w:r>
+        <w:t>- rainfall boundary interpretation</w:t>
+      </w:r>
+    </w:p>
+    <w:p/>
+    <w:p>
+      <w:r>
+        <w:rPr>
+          <w:b/>
+          <w:bCs/>
+        </w:rPr>
+        <w:t>## Planned changes relative to the reference case</w:t>
+      </w:r>
+    </w:p>
+    <w:p>
+      <w:r>
+        <w:t>Compared with the rainfall infiltration reference case, the new project will gradually replace:</w:t>
+      </w:r>
+    </w:p>
+    <w:p>
+      <w:r>
+        <w:t>- rainfall boundary with slurry pouring / inflow boundary</w:t>
+      </w:r>
+    </w:p>
+    <w:p>
+      <w:r>
+        <w:t>- unsaturated soil hydraulic interpretation with slurry transport interpretation</w:t>
+      </w:r>
+    </w:p>
+    <w:p>
+      <w:r>
+        <w:lastRenderedPageBreak/>
+        <w:t>- soil-column test geometry with engineering-scale waste-rock geometry</w:t>
+      </w:r>
+    </w:p>
+    <w:p>
+      <w:r>
+        <w:t>- reference material parameters with waste-rock and slurry parameters</w:t>
+      </w:r>
+    </w:p>
+    <w:p/>
+    <w:p>
+      <w:r>
+        <w:rPr>
+          <w:b/>
+          <w:bCs/>
+        </w:rPr>
+        <w:t>## Expected outputs</w:t>
+      </w:r>
+    </w:p>
+    <w:p>
+      <w:r>
+        <w:t>Expected outputs may include:</w:t>
+      </w:r>
+    </w:p>
+    <w:p>
+      <w:r>
+        <w:t>- slurry pressure-like field</w:t>
+      </w:r>
+    </w:p>
+    <w:p>
+      <w:r>
+        <w:t>- velocity / flux field</w:t>
+      </w:r>
+    </w:p>
+    <w:p>
+      <w:r>
+        <w:t>- penetration depth</w:t>
+      </w:r>
+    </w:p>
+    <w:p>
+      <w:r>
+        <w:t>- local filling degree / saturation-like indicator</w:t>
+      </w:r>
+    </w:p>
+    <w:p>
+      <w:r>
+        <w:t>- deposition or clogging-related indicator if needed later</w:t>
+      </w:r>
+    </w:p>
+    <w:p/>
+    <w:p>
+      <w:r>
+        <w:rPr>
+          <w:b/>
+          <w:bCs/>
+        </w:rPr>
+        <w:t>## Current strategy</w:t>
+      </w:r>
+    </w:p>
+    <w:p>
+      <w:r>
+        <w:t>At the current stage, the priority is:</w:t>
+      </w:r>
+    </w:p>
+    <w:p>
+      <w:r>
+        <w:t>1. preserve the original PFC2D + FiPy data-exchange logic from the reference case</w:t>
+      </w:r>
+    </w:p>
+    <w:p>
+      <w:r>
+        <w:t>2. reuse the coupling workflow</w:t>
+      </w:r>
+    </w:p>
+    <w:p>
+      <w:r>
+        <w:t>3. gradually replace the physical model and engineering geometry</w:t>
+      </w:r>
+    </w:p>
+    <w:p>
+      <w:r>
+        <w:t>4. avoid premature large-scale refactoring</w:t>
+      </w:r>
+    </w:p>
+    <w:p/>
+    <w:p>
+      <w:r>
+        <w:rPr>
+          <w:b/>
+          <w:bCs/>
+        </w:rPr>
+        <w:t>## Fixed structural assumptions</w:t>
+      </w:r>
+    </w:p>
+    <w:p/>
+    <w:p>
+      <w:r>
+        <w:t>For the current project stage, the following assumptions are fixed:</w:t>
+      </w:r>
+    </w:p>
+    <w:p/>
+    <w:p>
+      <w:r>
+        <w:t>1. The waste-rock particle skeleton is rigid and does not deform under fluid action.</w:t>
+      </w:r>
+    </w:p>
+    <w:p>
+      <w:r>
+        <w:t>2. Porosity is transferred from PFC to FiPy only once at initialization.</w:t>
+      </w:r>
+    </w:p>
+    <w:p>
+      <w:r>
+        <w:t>3. Porosity is not updated during later flow steps.</w:t>
+      </w:r>
+    </w:p>
+    <w:p>
+      <w:r>
+        <w:t>4. The particle model is treated as fixed/specific, so no automatic particle-model adaptation is required.</w:t>
+      </w:r>
+    </w:p>
+    <w:p/>
+    <w:p>
+      <w:r>
+        <w:rPr>
+          <w:b/>
+          <w:bCs/>
+        </w:rPr>
+        <w:t>## Modeling interpretation</w:t>
+      </w:r>
+    </w:p>
+    <w:p/>
+    <w:p>
+      <w:r>
+        <w:t>Under these assumptions:</w:t>
+      </w:r>
+    </w:p>
+    <w:p>
+      <w:r>
+        <w:t>- geometric porosity is treated as constant during the flow simulation</w:t>
+      </w:r>
+    </w:p>
+    <w:p>
+      <w:r>
+        <w:t>- permeability / intrinsic mobility is initialized once from the initial structure</w:t>
+      </w:r>
+    </w:p>
+    <w:p>
+      <w:r>
+        <w:t>- later flow evolution is represented on the FiPy side only</w:t>
+      </w:r>
+    </w:p>
+    <w:p>
+      <w:r>
+        <w:t>- fluid results are written back to particle extra values for diagnostics / visualization only</w:t>
+      </w:r>
+    </w:p>
+    <w:p/>
+    <w:p>
+      <w:pPr>
+        <w:rPr>
+          <w:rFonts w:hint="eastAsia"/>
+        </w:rPr>
+      </w:pPr>
     </w:p>
     <w:p>
       <w:pPr>
@@ -71,6 +1465,7 @@
         <w:rPr>
           <w:rFonts w:hint="eastAsia"/>
         </w:rPr>
+        <w:lastRenderedPageBreak/>
         <w:t>outputs</w:t>
       </w:r>
     </w:p>
@@ -89,9 +1484,6 @@
     <w:p>
       <w:pPr>
         <w:pStyle w:val="3"/>
-        <w:rPr>
-          <w:rFonts w:hint="eastAsia"/>
-        </w:rPr>
       </w:pPr>
       <w:r>
         <w:rPr>
@@ -108,10 +1500,396 @@
     </w:p>
     <w:p>
       <w:pPr>
+        <w:pStyle w:val="4"/>
+      </w:pPr>
+      <w:r>
+        <w:rPr>
+          <w:rFonts w:hint="eastAsia"/>
+        </w:rPr>
+        <w:t>pfc</w:t>
+      </w:r>
+    </w:p>
+    <w:p>
+      <w:pPr>
+        <w:pStyle w:val="4"/>
+      </w:pPr>
+      <w:r>
+        <w:rPr>
+          <w:rFonts w:hint="eastAsia"/>
+        </w:rPr>
+        <w:t>py</w:t>
+      </w:r>
+    </w:p>
+    <w:p>
+      <w:pPr>
+        <w:pStyle w:val="4"/>
+      </w:pPr>
+      <w:r>
+        <w:rPr>
+          <w:rFonts w:hint="eastAsia"/>
+        </w:rPr>
+        <w:t>raw_word</w:t>
+      </w:r>
+    </w:p>
+    <w:p>
+      <w:pPr>
+        <w:pStyle w:val="4"/>
+      </w:pPr>
+      <w:r>
+        <w:rPr>
+          <w:rFonts w:hint="eastAsia"/>
+        </w:rPr>
+        <w:t>notes.md</w:t>
+      </w:r>
+    </w:p>
+    <w:p>
+      <w:r>
+        <w:rPr>
+          <w:b/>
+          <w:bCs/>
+        </w:rPr>
+        <w:t># notes</w:t>
+      </w:r>
+    </w:p>
+    <w:p/>
+    <w:p>
+      <w:r>
+        <w:t xml:space="preserve">- </w:t>
+      </w:r>
+      <w:r>
+        <w:t>该案例先运行</w:t>
+      </w:r>
+      <w:r>
+        <w:t xml:space="preserve"> 01_sample</w:t>
+      </w:r>
+      <w:r>
+        <w:t>，再运行</w:t>
+      </w:r>
+      <w:r>
+        <w:t xml:space="preserve"> 02_balance</w:t>
+      </w:r>
+      <w:r>
+        <w:t>。</w:t>
+      </w:r>
+    </w:p>
+    <w:p>
+      <w:r>
+        <w:t xml:space="preserve">- 01_mesh.py </w:t>
+      </w:r>
+      <w:r>
+        <w:t>会建立</w:t>
+      </w:r>
+      <w:r>
+        <w:t xml:space="preserve"> FiPy </w:t>
+      </w:r>
+      <w:r>
+        <w:t>网格，并恢复</w:t>
+      </w:r>
+      <w:r>
+        <w:t xml:space="preserve"> balance</w:t>
+      </w:r>
+      <w:r>
+        <w:t>。</w:t>
+      </w:r>
+    </w:p>
+    <w:p>
+      <w:r>
+        <w:t xml:space="preserve">- 03_cal.p2dat </w:t>
+      </w:r>
+      <w:r>
+        <w:t>是总控脚本。</w:t>
+      </w:r>
+    </w:p>
+    <w:p>
+      <w:r>
+        <w:t>- 02_set_up.py</w:t>
+      </w:r>
+      <w:r>
+        <w:t>、</w:t>
+      </w:r>
+      <w:r>
+        <w:t>03_solver.py</w:t>
+      </w:r>
+      <w:r>
+        <w:t>、</w:t>
+      </w:r>
+      <w:r>
+        <w:t xml:space="preserve">04_cal_value.py </w:t>
+      </w:r>
+      <w:r>
+        <w:t>依赖共享变量，暂时不能随意独立改写。</w:t>
+      </w:r>
+    </w:p>
+    <w:p>
+      <w:r>
+        <w:t xml:space="preserve">- </w:t>
+      </w:r>
+      <w:r>
+        <w:t>第一阶段目标是保真还原，不做结构重构。</w:t>
+      </w:r>
+    </w:p>
+    <w:p>
+      <w:pPr>
+        <w:rPr>
+          <w:rFonts w:hint="eastAsia"/>
+        </w:rPr>
+      </w:pPr>
+    </w:p>
+    <w:p>
+      <w:pPr>
+        <w:pStyle w:val="4"/>
+      </w:pPr>
+      <w:r>
+        <w:rPr>
+          <w:rFonts w:hint="eastAsia"/>
+        </w:rPr>
+        <w:t>README.md</w:t>
+      </w:r>
+    </w:p>
+    <w:p>
+      <w:r>
+        <w:rPr>
+          <w:b/>
+          <w:bCs/>
+        </w:rPr>
+        <w:t># case_01_rainfall_infiltration_2d</w:t>
+      </w:r>
+    </w:p>
+    <w:p/>
+    <w:p>
+      <w:r>
+        <w:rPr>
+          <w:b/>
+          <w:bCs/>
+        </w:rPr>
+        <w:t xml:space="preserve">## </w:t>
+      </w:r>
+      <w:r>
+        <w:rPr>
+          <w:b/>
+          <w:bCs/>
+        </w:rPr>
+        <w:t>案例作用</w:t>
+      </w:r>
+    </w:p>
+    <w:p>
+      <w:r>
+        <w:t>二维降雨入渗土柱耦合案例，包含</w:t>
+      </w:r>
+      <w:r>
+        <w:t xml:space="preserve"> PFC2D </w:t>
+      </w:r>
+      <w:r>
+        <w:t>建样、重力平衡、</w:t>
+      </w:r>
+      <w:r>
+        <w:t xml:space="preserve">FiPy </w:t>
+      </w:r>
+      <w:r>
+        <w:t>网格求解和结果回写颗粒。</w:t>
+      </w:r>
+    </w:p>
+    <w:p/>
+    <w:p>
+      <w:r>
+        <w:rPr>
+          <w:b/>
+          <w:bCs/>
+        </w:rPr>
+        <w:t xml:space="preserve">## </w:t>
+      </w:r>
+      <w:r>
+        <w:rPr>
+          <w:b/>
+          <w:bCs/>
+        </w:rPr>
+        <w:t>文件说明</w:t>
+      </w:r>
+    </w:p>
+    <w:p>
+      <w:r>
+        <w:t>- pfc/01_sample.p2dat</w:t>
+      </w:r>
+      <w:r>
+        <w:t>：建样并保存</w:t>
+      </w:r>
+      <w:r>
+        <w:t xml:space="preserve"> sample</w:t>
+      </w:r>
+    </w:p>
+    <w:p>
+      <w:r>
+        <w:t>- pfc/02_balance.p2dat</w:t>
+      </w:r>
+      <w:r>
+        <w:t>：重力平衡并保存</w:t>
+      </w:r>
+      <w:r>
+        <w:t xml:space="preserve"> balance</w:t>
+      </w:r>
+    </w:p>
+    <w:p>
+      <w:r>
+        <w:t>- py/01_mesh.py</w:t>
+      </w:r>
+      <w:r>
+        <w:t>：创建</w:t>
+      </w:r>
+      <w:r>
+        <w:t xml:space="preserve"> FiPy </w:t>
+      </w:r>
+      <w:r>
+        <w:t>网格和基本变量，并从</w:t>
+      </w:r>
+      <w:r>
+        <w:t xml:space="preserve"> balance </w:t>
+      </w:r>
+      <w:r>
+        <w:t>生成</w:t>
+      </w:r>
+      <w:r>
+        <w:t xml:space="preserve"> mesh </w:t>
+      </w:r>
+      <w:r>
+        <w:t>状态</w:t>
+      </w:r>
+    </w:p>
+    <w:p>
+      <w:r>
+        <w:t>- py/02_set_up.py</w:t>
+      </w:r>
+      <w:r>
+        <w:t>：初始化水力变量</w:t>
+      </w:r>
+    </w:p>
+    <w:p>
+      <w:r>
+        <w:t>- py/03_solver.py</w:t>
+      </w:r>
+      <w:r>
+        <w:t>：单步</w:t>
+      </w:r>
+      <w:r>
+        <w:t xml:space="preserve"> FiPy </w:t>
+      </w:r>
+      <w:r>
+        <w:t>求解</w:t>
+      </w:r>
+    </w:p>
+    <w:p>
+      <w:r>
+        <w:t>- py/04_cal_value.py</w:t>
+      </w:r>
+      <w:r>
+        <w:t>：把场变量映射回颗粒</w:t>
+      </w:r>
+    </w:p>
+    <w:p>
+      <w:r>
+        <w:t>- pfc/03_cal.p2dat</w:t>
+      </w:r>
+      <w:r>
+        <w:t>：耦合主循环</w:t>
+      </w:r>
+    </w:p>
+    <w:p/>
+    <w:p>
+      <w:r>
+        <w:rPr>
+          <w:b/>
+          <w:bCs/>
+        </w:rPr>
+        <w:t xml:space="preserve">## </w:t>
+      </w:r>
+      <w:r>
+        <w:rPr>
+          <w:b/>
+          <w:bCs/>
+        </w:rPr>
+        <w:t>原始来源</w:t>
+      </w:r>
+    </w:p>
+    <w:p>
+      <w:r>
+        <w:t>由</w:t>
+      </w:r>
+      <w:r>
+        <w:t xml:space="preserve"> Word </w:t>
+      </w:r>
+      <w:r>
+        <w:t>文档《降雨入渗土柱试验二维案例》拆分整理。</w:t>
+      </w:r>
+    </w:p>
+    <w:p/>
+    <w:p>
+      <w:r>
+        <w:rPr>
+          <w:b/>
+          <w:bCs/>
+        </w:rPr>
+        <w:lastRenderedPageBreak/>
+        <w:t xml:space="preserve">## </w:t>
+      </w:r>
+      <w:r>
+        <w:rPr>
+          <w:b/>
+          <w:bCs/>
+        </w:rPr>
+        <w:t>当前状态</w:t>
+      </w:r>
+    </w:p>
+    <w:p>
+      <w:r>
+        <w:t>第一版为</w:t>
+      </w:r>
+      <w:r>
+        <w:t>“</w:t>
+      </w:r>
+      <w:r>
+        <w:t>按原始逻辑还原</w:t>
+      </w:r>
+      <w:r>
+        <w:t>”</w:t>
+      </w:r>
+      <w:r>
+        <w:t>，未做结构性重构。</w:t>
+      </w:r>
+    </w:p>
+    <w:p/>
+    <w:p>
+      <w:r>
+        <w:rPr>
+          <w:b/>
+          <w:bCs/>
+        </w:rPr>
+        <w:t xml:space="preserve">## </w:t>
+      </w:r>
+      <w:r>
+        <w:rPr>
+          <w:b/>
+          <w:bCs/>
+        </w:rPr>
+        <w:t>注意事项</w:t>
+      </w:r>
+    </w:p>
+    <w:p>
+      <w:r>
+        <w:t xml:space="preserve">Python </w:t>
+      </w:r>
+      <w:r>
+        <w:t>各脚本共享运行上下文，暂时不能随意单独运行。</w:t>
+      </w:r>
+    </w:p>
+    <w:p>
+      <w:pPr>
+        <w:rPr>
+          <w:rFonts w:hint="eastAsia"/>
+        </w:rPr>
+      </w:pPr>
+    </w:p>
+    <w:p>
+      <w:pPr>
         <w:pStyle w:val="3"/>
-        <w:rPr>
-          <w:rFonts w:hint="eastAsia"/>
-        </w:rPr>
       </w:pPr>
       <w:r>
         <w:rPr>
@@ -119,6 +1897,998 @@
         </w:rPr>
         <w:t>case_02_grouting_porosity_to_k</w:t>
       </w:r>
+    </w:p>
+    <w:p>
+      <w:pPr>
+        <w:pStyle w:val="4"/>
+      </w:pPr>
+      <w:r>
+        <w:rPr>
+          <w:rFonts w:hint="eastAsia"/>
+        </w:rPr>
+        <w:t>extracted_logic</w:t>
+      </w:r>
+    </w:p>
+    <w:p>
+      <w:pPr>
+        <w:pStyle w:val="5"/>
+      </w:pPr>
+      <w:r>
+        <w:rPr>
+          <w:rFonts w:hint="eastAsia"/>
+        </w:rPr>
+        <w:t>porosity_to_k_notes.md</w:t>
+      </w:r>
+    </w:p>
+    <w:p>
+      <w:r>
+        <w:rPr>
+          <w:b/>
+          <w:bCs/>
+        </w:rPr>
+        <w:t># Porosity-to-Permeability Notes</w:t>
+      </w:r>
+    </w:p>
+    <w:p/>
+    <w:p>
+      <w:r>
+        <w:rPr>
+          <w:b/>
+          <w:bCs/>
+        </w:rPr>
+        <w:t>## Purpose</w:t>
+      </w:r>
+    </w:p>
+    <w:p>
+      <w:r>
+        <w:t>This note extracts only the reusable "PFC porosity / structure -&gt; FiPy permeability" logic from case_02.</w:t>
+      </w:r>
+    </w:p>
+    <w:p/>
+    <w:p>
+      <w:r>
+        <w:t>The goal is not to copy the full grouting case, but to isolate a mechanism that can be re-implemented in the main project.</w:t>
+      </w:r>
+    </w:p>
+    <w:p/>
+    <w:p>
+      <w:r>
+        <w:rPr>
+          <w:b/>
+          <w:bCs/>
+        </w:rPr>
+        <w:t>## Core reusable mechanism</w:t>
+      </w:r>
+    </w:p>
+    <w:p/>
+    <w:p>
+      <w:r>
+        <w:rPr>
+          <w:b/>
+          <w:bCs/>
+        </w:rPr>
+        <w:t>### Step 1: build FiPy cells and a PFC-side spatial mapping</w:t>
+      </w:r>
+    </w:p>
+    <w:p>
+      <w:r>
+        <w:t>The reference case creates FiPy cells and then generates corresponding PFC-side geometry / grouping information so that each FiPy cell can be associated with a local particle region.</w:t>
+      </w:r>
+    </w:p>
+    <w:p/>
+    <w:p>
+      <w:r>
+        <w:t>This is the key prerequisite for transferring local PFC information into FiPy cell variables.</w:t>
+      </w:r>
+    </w:p>
+    <w:p/>
+    <w:p>
+      <w:r>
+        <w:rPr>
+          <w:b/>
+          <w:bCs/>
+        </w:rPr>
+        <w:t>### Step 2: obtain local structural information from PFC</w:t>
+      </w:r>
+    </w:p>
+    <w:p>
+      <w:r>
+        <w:t>The reference case shows that local porosity can be queried from PFC measurement objects.</w:t>
+      </w:r>
+    </w:p>
+    <w:p/>
+    <w:p>
+      <w:r>
+        <w:t>For the current main project, this idea is useful even if the exact implementation details later change.</w:t>
+      </w:r>
+    </w:p>
+    <w:p/>
+    <w:p>
+      <w:r>
+        <w:t>The main reusable concept is:</w:t>
+      </w:r>
+    </w:p>
+    <w:p>
+      <w:r>
+        <w:t>- each FiPy cell should have access to one local porosity / void-ratio-like value derived from the waste-rock structure</w:t>
+      </w:r>
+    </w:p>
+    <w:p/>
+    <w:p>
+      <w:r>
+        <w:rPr>
+          <w:b/>
+          <w:bCs/>
+        </w:rPr>
+        <w:t>### Step 3: convert porosity into permeability / mobility</w:t>
+      </w:r>
+    </w:p>
+    <w:p>
+      <w:r>
+        <w:t>The reference case suggests that a FiPy cell permeability field `kk` can be derived from local structure information.</w:t>
+      </w:r>
+    </w:p>
+    <w:p/>
+    <w:p>
+      <w:r>
+        <w:t>For the current main project, this should be simplified into:</w:t>
+      </w:r>
+    </w:p>
+    <w:p/>
+    <w:p>
+      <w:r>
+        <w:t>- read local porosity once from PFC at initialization</w:t>
+      </w:r>
+    </w:p>
+    <w:p>
+      <w:r>
+        <w:t>- compute a cell-wise permeability / mobility field once</w:t>
+      </w:r>
+    </w:p>
+    <w:p>
+      <w:r>
+        <w:t>- store it in FiPy as an initial structural property field</w:t>
+      </w:r>
+    </w:p>
+    <w:p/>
+    <w:p>
+      <w:r>
+        <w:t>This means the current main project does NOT need:</w:t>
+      </w:r>
+    </w:p>
+    <w:p>
+      <w:r>
+        <w:t>- repeated porosity updates during flow</w:t>
+      </w:r>
+    </w:p>
+    <w:p>
+      <w:r>
+        <w:t>- repeated fracture-driven `kk` updates</w:t>
+      </w:r>
+    </w:p>
+    <w:p>
+      <w:r>
+        <w:t>- dynamic permeability recomputation every cycle</w:t>
+      </w:r>
+    </w:p>
+    <w:p/>
+    <w:p>
+      <w:r>
+        <w:rPr>
+          <w:b/>
+          <w:bCs/>
+        </w:rPr>
+        <w:t>### Step 4: use the initialized permeability / mobility in FiPy</w:t>
+      </w:r>
+    </w:p>
+    <w:p>
+      <w:r>
+        <w:t>After the initial `kk` / mobility field is created, FiPy uses it in the placeholder slurry-transport solve.</w:t>
+      </w:r>
+    </w:p>
+    <w:p/>
+    <w:p>
+      <w:r>
+        <w:t>For the current project, this fits the intended simplification:</w:t>
+      </w:r>
+    </w:p>
+    <w:p>
+      <w:r>
+        <w:t>- PFC provides static structure</w:t>
+      </w:r>
+    </w:p>
+    <w:p>
+      <w:r>
+        <w:t>- FiPy solves the continuum flow field</w:t>
+      </w:r>
+    </w:p>
+    <w:p>
+      <w:r>
+        <w:t>- PFC is not mechanically updated by the fluid</w:t>
+      </w:r>
+    </w:p>
+    <w:p/>
+    <w:p>
+      <w:r>
+        <w:rPr>
+          <w:b/>
+          <w:bCs/>
+        </w:rPr>
+        <w:t>### Step 5: write flow results back to particles</w:t>
+      </w:r>
+    </w:p>
+    <w:p>
+      <w:r>
+        <w:t>The reference case also writes flow-related quantities back to particle extra values.</w:t>
+      </w:r>
+    </w:p>
+    <w:p/>
+    <w:p>
+      <w:r>
+        <w:t>This part is directly relevant to the current project, because the current repository already uses particle extra values for:</w:t>
+      </w:r>
+    </w:p>
+    <w:p>
+      <w:r>
+        <w:t>- pressure-like field</w:t>
+      </w:r>
+    </w:p>
+    <w:p>
+      <w:r>
+        <w:t>- flux vector</w:t>
+      </w:r>
+    </w:p>
+    <w:p>
+      <w:r>
+        <w:t>- filling indicator</w:t>
+      </w:r>
+    </w:p>
+    <w:p>
+      <w:r>
+        <w:t>- clogging indicator</w:t>
+      </w:r>
+    </w:p>
+    <w:p/>
+    <w:p>
+      <w:r>
+        <w:rPr>
+          <w:b/>
+          <w:bCs/>
+        </w:rPr>
+        <w:t>## Recommended interpretation for the current main project</w:t>
+      </w:r>
+    </w:p>
+    <w:p/>
+    <w:p>
+      <w:r>
+        <w:rPr>
+          <w:b/>
+          <w:bCs/>
+        </w:rPr>
+        <w:t>### Reuse</w:t>
+      </w:r>
+    </w:p>
+    <w:p>
+      <w:r>
+        <w:t>Reuse the case only for:</w:t>
+      </w:r>
+    </w:p>
+    <w:p>
+      <w:r>
+        <w:t>- local porosity acquisition logic</w:t>
+      </w:r>
+    </w:p>
+    <w:p>
+      <w:r>
+        <w:t>- spatial mapping from PFC regions to FiPy cells</w:t>
+      </w:r>
+    </w:p>
+    <w:p>
+      <w:r>
+        <w:t>- initialization of cell-wise permeability / mobility</w:t>
+      </w:r>
+    </w:p>
+    <w:p>
+      <w:r>
+        <w:t>- writeback pattern from FiPy to particle extra values</w:t>
+      </w:r>
+    </w:p>
+    <w:p/>
+    <w:p>
+      <w:r>
+        <w:rPr>
+          <w:b/>
+          <w:bCs/>
+        </w:rPr>
+        <w:t>### Do not reuse directly</w:t>
+      </w:r>
+    </w:p>
+    <w:p>
+      <w:r>
+        <w:t>Do not reuse directly:</w:t>
+      </w:r>
+    </w:p>
+    <w:p>
+      <w:r>
+        <w:t>- dynamic fracture-to-permeability logic</w:t>
+      </w:r>
+    </w:p>
+    <w:p>
+      <w:r>
+        <w:t>- repeated in-loop `kk` modification from evolving PFC structure</w:t>
+      </w:r>
+    </w:p>
+    <w:p>
+      <w:r>
+        <w:lastRenderedPageBreak/>
+        <w:t>- fluid-force application to particles</w:t>
+      </w:r>
+    </w:p>
+    <w:p>
+      <w:r>
+        <w:t>- the full loading sequence of the original case</w:t>
+      </w:r>
+    </w:p>
+    <w:p/>
+    <w:p>
+      <w:r>
+        <w:rPr>
+          <w:b/>
+          <w:bCs/>
+        </w:rPr>
+        <w:t>## Proposed implementation target in src/</w:t>
+      </w:r>
+    </w:p>
+    <w:p/>
+    <w:p>
+      <w:r>
+        <w:t>A suitable main-project implementation path is:</w:t>
+      </w:r>
+    </w:p>
+    <w:p/>
+    <w:p>
+      <w:r>
+        <w:t>- `src/pfc_adapter/porosity_reader.py`</w:t>
+      </w:r>
+    </w:p>
+    <w:p>
+      <w:r>
+        <w:t>  - read local porosity / structure information from PFC</w:t>
+      </w:r>
+    </w:p>
+    <w:p/>
+    <w:p>
+      <w:r>
+        <w:t>- `src/coupling/porosity_to_permeability.py`</w:t>
+      </w:r>
+    </w:p>
+    <w:p>
+      <w:r>
+        <w:t>  - convert local porosity into cell permeability / mobility</w:t>
+      </w:r>
+    </w:p>
+    <w:p/>
+    <w:p>
+      <w:r>
+        <w:t>- `src/models/slurry_transport/variables.py`</w:t>
+      </w:r>
+    </w:p>
+    <w:p>
+      <w:r>
+        <w:t>  - store the initialized mobility field</w:t>
+      </w:r>
+    </w:p>
+    <w:p/>
+    <w:p>
+      <w:r>
+        <w:t>- `src/models/slurry_transport/equations.py`</w:t>
+      </w:r>
+    </w:p>
+    <w:p>
+      <w:r>
+        <w:t>  - use that mobility field in the FiPy solve without repeated structural updating</w:t>
+      </w:r>
+    </w:p>
+    <w:p/>
+    <w:p>
+      <w:r>
+        <w:rPr>
+          <w:b/>
+          <w:bCs/>
+        </w:rPr>
+        <w:t>## One-time initialization rule</w:t>
+      </w:r>
+    </w:p>
+    <w:p>
+      <w:r>
+        <w:t>For the current project, the intended rule is:</w:t>
+      </w:r>
+    </w:p>
+    <w:p/>
+    <w:p>
+      <w:r>
+        <w:t>1. build or restore the waste-rock pile in PFC</w:t>
+      </w:r>
+    </w:p>
+    <w:p>
+      <w:r>
+        <w:t>2. read local porosity once</w:t>
+      </w:r>
+    </w:p>
+    <w:p>
+      <w:r>
+        <w:t>3. initialize FiPy permeability / mobility once</w:t>
+      </w:r>
+    </w:p>
+    <w:p>
+      <w:r>
+        <w:t>4. run the slurry-flow solve</w:t>
+      </w:r>
+    </w:p>
+    <w:p>
+      <w:r>
+        <w:t>5. write fluid-related results back to particle extra values</w:t>
+      </w:r>
+    </w:p>
+    <w:p>
+      <w:r>
+        <w:t>6. do not update the waste-rock skeleton or porosity during subsequent flow steps</w:t>
+      </w:r>
+    </w:p>
+    <w:p/>
+    <w:p>
+      <w:r>
+        <w:t>This is the key simplification relative to the original reference case.</w:t>
+      </w:r>
+    </w:p>
+    <w:p>
+      <w:pPr>
+        <w:rPr>
+          <w:rFonts w:hint="eastAsia"/>
+        </w:rPr>
+      </w:pPr>
+    </w:p>
+    <w:p>
+      <w:pPr>
+        <w:pStyle w:val="4"/>
+      </w:pPr>
+      <w:r>
+        <w:rPr>
+          <w:rFonts w:hint="eastAsia"/>
+        </w:rPr>
+        <w:t>pfc</w:t>
+      </w:r>
+    </w:p>
+    <w:p>
+      <w:pPr>
+        <w:pStyle w:val="4"/>
+      </w:pPr>
+      <w:r>
+        <w:rPr>
+          <w:rFonts w:hint="eastAsia"/>
+        </w:rPr>
+        <w:t>py</w:t>
+      </w:r>
+    </w:p>
+    <w:p>
+      <w:pPr>
+        <w:pStyle w:val="4"/>
+      </w:pPr>
+      <w:r>
+        <w:rPr>
+          <w:rFonts w:hint="eastAsia"/>
+        </w:rPr>
+        <w:t>raw_word</w:t>
+      </w:r>
+    </w:p>
+    <w:p>
+      <w:pPr>
+        <w:pStyle w:val="4"/>
+      </w:pPr>
+      <w:r>
+        <w:rPr>
+          <w:rFonts w:hint="eastAsia"/>
+        </w:rPr>
+        <w:t>notes.md</w:t>
+      </w:r>
+    </w:p>
+    <w:p>
+      <w:r>
+        <w:rPr>
+          <w:b/>
+          <w:bCs/>
+        </w:rPr>
+        <w:t># case_02_grouting_porosity_to_k - notes</w:t>
+      </w:r>
+    </w:p>
+    <w:p/>
+    <w:p>
+      <w:r>
+        <w:rPr>
+          <w:b/>
+          <w:bCs/>
+        </w:rPr>
+        <w:t>## Case role in this repository</w:t>
+      </w:r>
+    </w:p>
+    <w:p>
+      <w:r>
+        <w:t xml:space="preserve">This case is stored as a mechanism reference, not as a production model to be copied </w:t>
+      </w:r>
+      <w:r>
+        <w:lastRenderedPageBreak/>
+        <w:t>directly.</w:t>
+      </w:r>
+    </w:p>
+    <w:p/>
+    <w:p>
+      <w:r>
+        <w:t>Its main value is to show how PFC-side structural information can be transferred to FiPy-side cell properties, especially:</w:t>
+      </w:r>
+    </w:p>
+    <w:p>
+      <w:r>
+        <w:t>- local cell/group mapping between PFC and FiPy</w:t>
+      </w:r>
+    </w:p>
+    <w:p>
+      <w:r>
+        <w:t>- porosity-related information acquisition on the PFC side</w:t>
+      </w:r>
+    </w:p>
+    <w:p>
+      <w:r>
+        <w:t>- updating FiPy permeability / mobility-like fields from PFC-side structure</w:t>
+      </w:r>
+    </w:p>
+    <w:p>
+      <w:r>
+        <w:t>- writing FiPy results back to particle extra values</w:t>
+      </w:r>
+    </w:p>
+    <w:p/>
+    <w:p>
+      <w:r>
+        <w:rPr>
+          <w:b/>
+          <w:bCs/>
+        </w:rPr>
+        <w:t>## What is reused from this case</w:t>
+      </w:r>
+    </w:p>
+    <w:p>
+      <w:r>
+        <w:t>For the current waste-rock slurry-filling project, the reusable part is:</w:t>
+      </w:r>
+    </w:p>
+    <w:p/>
+    <w:p>
+      <w:r>
+        <w:t>1. establish a mapping between FiPy cells and PFC local regions / particle groups</w:t>
+      </w:r>
+    </w:p>
+    <w:p>
+      <w:r>
+        <w:t>2. obtain local porosity or structure-related information from PFC</w:t>
+      </w:r>
+    </w:p>
+    <w:p>
+      <w:r>
+        <w:t>3. convert that information into an initial FiPy permeability / mobility field</w:t>
+      </w:r>
+    </w:p>
+    <w:p>
+      <w:r>
+        <w:t>4. solve the FiPy continuum field</w:t>
+      </w:r>
+    </w:p>
+    <w:p>
+      <w:r>
+        <w:t>5. write flow-related results back to particle extra variables for visualization / diagnostics</w:t>
+      </w:r>
+    </w:p>
+    <w:p/>
+    <w:p>
+      <w:r>
+        <w:rPr>
+          <w:b/>
+          <w:bCs/>
+        </w:rPr>
+        <w:t>## What is NOT reused directly</w:t>
+      </w:r>
+    </w:p>
+    <w:p>
+      <w:r>
+        <w:t>The following parts of this reference case are not adopted directly into the current main project:</w:t>
+      </w:r>
+    </w:p>
+    <w:p/>
+    <w:p>
+      <w:r>
+        <w:t>- repeated permeability updates driven by fracture evolution</w:t>
+      </w:r>
+    </w:p>
+    <w:p>
+      <w:r>
+        <w:t>- dynamic fracture-based permeability increase logic</w:t>
+      </w:r>
+    </w:p>
+    <w:p>
+      <w:r>
+        <w:t>- direct fluid-force application back onto the particle skeleton</w:t>
+      </w:r>
+    </w:p>
+    <w:p>
+      <w:r>
+        <w:t>- coupled mechanical response of the waste-rock skeleton to fluid loading</w:t>
+      </w:r>
+    </w:p>
+    <w:p>
+      <w:r>
+        <w:t>- using this case as the final physical model of slurry transport</w:t>
+      </w:r>
+    </w:p>
+    <w:p/>
+    <w:p>
+      <w:r>
+        <w:rPr>
+          <w:b/>
+          <w:bCs/>
+        </w:rPr>
+        <w:t>## Important project-specific interpretation</w:t>
+      </w:r>
+    </w:p>
+    <w:p>
+      <w:r>
+        <w:t>In the current main project, PFC is used mainly to provide the waste-rock geometry and an initial porosity-based structural field.</w:t>
+      </w:r>
+    </w:p>
+    <w:p/>
+    <w:p>
+      <w:r>
+        <w:t>The intended workflow is:</w:t>
+      </w:r>
+    </w:p>
+    <w:p>
+      <w:r>
+        <w:t>- transfer porosity / structure information from PFC to FiPy once at initialization</w:t>
+      </w:r>
+    </w:p>
+    <w:p>
+      <w:r>
+        <w:t>- build an initial permeability / mobility field in FiPy</w:t>
+      </w:r>
+    </w:p>
+    <w:p>
+      <w:r>
+        <w:t>- keep the waste-rock skeleton fixed afterward</w:t>
+      </w:r>
+    </w:p>
+    <w:p>
+      <w:r>
+        <w:t>- do not update porosity continuously during flow</w:t>
+      </w:r>
+    </w:p>
+    <w:p>
+      <w:r>
+        <w:t>- do not let fluid forces drive particle motion</w:t>
+      </w:r>
+    </w:p>
+    <w:p>
+      <w:r>
+        <w:t>- only map flow-related quantities back to particle extra values</w:t>
+      </w:r>
+    </w:p>
+    <w:p/>
+    <w:p>
+      <w:r>
+        <w:rPr>
+          <w:b/>
+          <w:bCs/>
+        </w:rPr>
+        <w:t>## Practical takeaway</w:t>
+      </w:r>
+    </w:p>
+    <w:p>
+      <w:r>
+        <w:t>This case should be treated as a reference for:</w:t>
+      </w:r>
+    </w:p>
+    <w:p>
+      <w:r>
+        <w:t>- porosity-to-permeability initialization logic</w:t>
+      </w:r>
+    </w:p>
+    <w:p>
+      <w:r>
+        <w:lastRenderedPageBreak/>
+        <w:t>- PFC-to-FiPy structural data transfer</w:t>
+      </w:r>
+    </w:p>
+    <w:p>
+      <w:r>
+        <w:t>- FiPy-to-PFC result writeback style</w:t>
+      </w:r>
+    </w:p>
+    <w:p/>
+    <w:p>
+      <w:r>
+        <w:t>It should not be treated as the direct final solver architecture for the current project.</w:t>
+      </w:r>
+    </w:p>
+    <w:p>
+      <w:pPr>
+        <w:rPr>
+          <w:rFonts w:hint="eastAsia"/>
+        </w:rPr>
+      </w:pPr>
+    </w:p>
+    <w:p>
+      <w:pPr>
+        <w:pStyle w:val="4"/>
+      </w:pPr>
+      <w:r>
+        <w:rPr>
+          <w:rFonts w:hint="eastAsia"/>
+        </w:rPr>
+        <w:t>README.md</w:t>
+      </w:r>
+    </w:p>
+    <w:p>
+      <w:r>
+        <w:rPr>
+          <w:b/>
+          <w:bCs/>
+        </w:rPr>
+        <w:t># case_02_grouting_porosity_to_k</w:t>
+      </w:r>
+    </w:p>
+    <w:p/>
+    <w:p>
+      <w:r>
+        <w:rPr>
+          <w:b/>
+          <w:bCs/>
+        </w:rPr>
+        <w:t>## Case role</w:t>
+      </w:r>
+    </w:p>
+    <w:p>
+      <w:r>
+        <w:t>This case is stored as a reference case for one specific mechanism:</w:t>
+      </w:r>
+    </w:p>
+    <w:p/>
+    <w:p>
+      <w:r>
+        <w:rPr>
+          <w:b/>
+          <w:bCs/>
+        </w:rPr>
+        <w:t>**PFC local porosity / structure information -&gt; FiPy cell permeability or mobility initialization**</w:t>
+      </w:r>
+    </w:p>
+    <w:p/>
+    <w:p>
+      <w:r>
+        <w:t>It is not treated as the final solver architecture for the current waste-rock slurry-filling project.</w:t>
+      </w:r>
+    </w:p>
+    <w:p/>
+    <w:p>
+      <w:r>
+        <w:rPr>
+          <w:b/>
+          <w:bCs/>
+        </w:rPr>
+        <w:t>## Why this case is useful</w:t>
+      </w:r>
+    </w:p>
+    <w:p>
+      <w:r>
+        <w:t>This case is useful because it shows how to:</w:t>
+      </w:r>
+    </w:p>
+    <w:p>
+      <w:r>
+        <w:t>- build a mapping between PFC local regions and FiPy cells</w:t>
+      </w:r>
+    </w:p>
+    <w:p>
+      <w:r>
+        <w:t>- obtain local porosity / structure-related information from PFC</w:t>
+      </w:r>
+    </w:p>
+    <w:p>
+      <w:r>
+        <w:t>- use that information to initialize a FiPy permeability / mobility-like field</w:t>
+      </w:r>
+    </w:p>
+    <w:p>
+      <w:r>
+        <w:t>- write FiPy flow-related results back to particle extra values</w:t>
+      </w:r>
+    </w:p>
+    <w:p/>
+    <w:p>
+      <w:r>
+        <w:rPr>
+          <w:b/>
+          <w:bCs/>
+        </w:rPr>
+        <w:t>## What is intended to be reused</w:t>
+      </w:r>
+    </w:p>
+    <w:p>
+      <w:r>
+        <w:t>For the current main project, the intended reusable part is:</w:t>
+      </w:r>
+    </w:p>
+    <w:p/>
+    <w:p>
+      <w:r>
+        <w:t>1. PFC local structure / porosity acquisition</w:t>
+      </w:r>
+    </w:p>
+    <w:p>
+      <w:r>
+        <w:t>2. cell-wise mapping from PFC to FiPy</w:t>
+      </w:r>
+    </w:p>
+    <w:p>
+      <w:r>
+        <w:t>3. one-time initialization of FiPy mobility / permeability</w:t>
+      </w:r>
+    </w:p>
+    <w:p>
+      <w:r>
+        <w:t>4. flow-result writeback to particle extra values</w:t>
+      </w:r>
+    </w:p>
+    <w:p/>
+    <w:p>
+      <w:r>
+        <w:rPr>
+          <w:b/>
+          <w:bCs/>
+        </w:rPr>
+        <w:t>## What is NOT intended to be reused directly</w:t>
+      </w:r>
+    </w:p>
+    <w:p>
+      <w:r>
+        <w:t>The following parts are not intended to be copied directly into the current main project:</w:t>
+      </w:r>
+    </w:p>
+    <w:p/>
+    <w:p>
+      <w:r>
+        <w:t>- dynamic fracture-driven permeability updating</w:t>
+      </w:r>
+    </w:p>
+    <w:p>
+      <w:r>
+        <w:t>- repeated in-loop structure-to-permeability updates</w:t>
+      </w:r>
+    </w:p>
+    <w:p>
+      <w:r>
+        <w:t>- direct fluid-force application to the waste-rock skeleton</w:t>
+      </w:r>
+    </w:p>
+    <w:p>
+      <w:r>
+        <w:t>- full loading sequence and mechanical response logic of the original case</w:t>
+      </w:r>
+    </w:p>
+    <w:p/>
+    <w:p>
+      <w:r>
+        <w:rPr>
+          <w:b/>
+          <w:bCs/>
+        </w:rPr>
+        <w:t>## Current project interpretation</w:t>
+      </w:r>
+    </w:p>
+    <w:p>
+      <w:r>
+        <w:t>In the current waste-rock slurry-filling project:</w:t>
+      </w:r>
+    </w:p>
+    <w:p/>
+    <w:p>
+      <w:r>
+        <w:lastRenderedPageBreak/>
+        <w:t>- PFC provides the waste-rock geometry and initial porosity/structure information</w:t>
+      </w:r>
+    </w:p>
+    <w:p>
+      <w:r>
+        <w:t>- FiPy solves the continuum slurry-flow field</w:t>
+      </w:r>
+    </w:p>
+    <w:p>
+      <w:r>
+        <w:t>- porosity is transferred once at initialization</w:t>
+      </w:r>
+    </w:p>
+    <w:p>
+      <w:r>
+        <w:t>- permeability / mobility is initialized once</w:t>
+      </w:r>
+    </w:p>
+    <w:p>
+      <w:r>
+        <w:t>- the waste-rock skeleton is kept fixed during flow</w:t>
+      </w:r>
+    </w:p>
+    <w:p>
+      <w:r>
+        <w:t>- fluid results are written back to particle extra values only</w:t>
+      </w:r>
+    </w:p>
+    <w:p/>
+    <w:p>
+      <w:r>
+        <w:rPr>
+          <w:b/>
+          <w:bCs/>
+        </w:rPr>
+        <w:t>## File structure</w:t>
+      </w:r>
+    </w:p>
+    <w:p>
+      <w:r>
+        <w:t>- `raw_word/`: original Word source</w:t>
+      </w:r>
+    </w:p>
+    <w:p>
+      <w:r>
+        <w:t>- `pfc/`: PFC-side case files</w:t>
+      </w:r>
+    </w:p>
+    <w:p>
+      <w:r>
+        <w:t>- `py/`: Python / FiPy-side case files</w:t>
+      </w:r>
+    </w:p>
+    <w:p>
+      <w:r>
+        <w:t>- `notes.md`: overall notes for this case</w:t>
+      </w:r>
+    </w:p>
+    <w:p>
+      <w:r>
+        <w:t>- `extracted_logic/porosity_to_k_notes.md`: extracted reusable mechanism notes</w:t>
+      </w:r>
+    </w:p>
+    <w:p/>
+    <w:p>
+      <w:r>
+        <w:rPr>
+          <w:b/>
+          <w:bCs/>
+        </w:rPr>
+        <w:t>## Status</w:t>
+      </w:r>
+    </w:p>
+    <w:p>
+      <w:r>
+        <w:t>This case is kept as a mechanism reference only.</w:t>
+      </w:r>
+    </w:p>
+    <w:p>
+      <w:r>
+        <w:t>Main development should continue under `src/`, not inside this reference-case folder.</w:t>
+      </w:r>
+    </w:p>
+    <w:p>
+      <w:pPr>
+        <w:rPr>
+          <w:rFonts w:hint="eastAsia"/>
+        </w:rPr>
+      </w:pPr>
     </w:p>
     <w:p>
       <w:pPr>
@@ -135,6 +2905,9 @@
     <w:p>
       <w:pPr>
         <w:pStyle w:val="3"/>
+        <w:rPr>
+          <w:rFonts w:hint="eastAsia"/>
+        </w:rPr>
       </w:pPr>
       <w:r>
         <w:rPr>
@@ -142,14 +2915,59 @@
         </w:rPr>
         <w:t>diagnose_multistep</w:t>
       </w:r>
+      <w:r>
+        <w:rPr>
+          <w:rFonts w:hint="eastAsia"/>
+        </w:rPr>
+        <w:t>_cycle.py</w:t>
+      </w:r>
     </w:p>
     <w:p>
       <w:pPr>
         <w:pStyle w:val="3"/>
-        <w:rPr>
-          <w:rFonts w:hint="eastAsia"/>
-        </w:rPr>
-      </w:pPr>
+      </w:pPr>
+      <w:r>
+        <w:rPr>
+          <w:rFonts w:hint="eastAsia"/>
+        </w:rPr>
+        <w:t>diagnose_placeholder_cycle.py</w:t>
+      </w:r>
+    </w:p>
+    <w:p>
+      <w:pPr>
+        <w:pStyle w:val="3"/>
+      </w:pPr>
+      <w:r>
+        <w:rPr>
+          <w:rFonts w:hint="eastAsia"/>
+        </w:rPr>
+        <w:t>diagnose_sensitivity_multistep.py</w:t>
+      </w:r>
+    </w:p>
+    <w:p>
+      <w:pPr>
+        <w:pStyle w:val="3"/>
+      </w:pPr>
+      <w:r>
+        <w:rPr>
+          <w:rFonts w:hint="eastAsia"/>
+        </w:rPr>
+        <w:t>smoke_test_src.py</w:t>
+      </w:r>
+    </w:p>
+    <w:p>
+      <w:pPr>
+        <w:pStyle w:val="3"/>
+        <w:rPr>
+          <w:rFonts w:hint="eastAsia"/>
+        </w:rPr>
+      </w:pPr>
+      <w:r>
+        <w:rPr>
+          <w:rFonts w:hint="eastAsia"/>
+        </w:rPr>
+        <w:t>validate_particle_extras.py</w:t>
+      </w:r>
     </w:p>
     <w:p>
       <w:pPr>
@@ -165,6 +2983,316 @@
     </w:p>
     <w:p>
       <w:pPr>
+        <w:pStyle w:val="3"/>
+      </w:pPr>
+      <w:r>
+        <w:rPr>
+          <w:rFonts w:hint="eastAsia"/>
+        </w:rPr>
+        <w:t>coupling</w:t>
+      </w:r>
+    </w:p>
+    <w:p>
+      <w:pPr>
+        <w:pStyle w:val="4"/>
+      </w:pPr>
+      <w:r>
+        <w:rPr>
+          <w:rFonts w:hint="eastAsia"/>
+        </w:rPr>
+        <w:t>_init_.py</w:t>
+      </w:r>
+    </w:p>
+    <w:p>
+      <w:pPr>
+        <w:pStyle w:val="4"/>
+      </w:pPr>
+      <w:r>
+        <w:rPr>
+          <w:rFonts w:hint="eastAsia"/>
+        </w:rPr>
+        <w:t>driver.py</w:t>
+      </w:r>
+    </w:p>
+    <w:p>
+      <w:pPr>
+        <w:pStyle w:val="4"/>
+        <w:rPr>
+          <w:rFonts w:hint="eastAsia"/>
+        </w:rPr>
+      </w:pPr>
+      <w:r>
+        <w:rPr>
+          <w:rFonts w:hint="eastAsia"/>
+        </w:rPr>
+        <w:t>porosity_to_permeability.py</w:t>
+      </w:r>
+    </w:p>
+    <w:p>
+      <w:pPr>
+        <w:rPr>
+          <w:rFonts w:hint="eastAsia"/>
+        </w:rPr>
+      </w:pPr>
+    </w:p>
+    <w:p>
+      <w:pPr>
+        <w:pStyle w:val="3"/>
+      </w:pPr>
+      <w:r>
+        <w:rPr>
+          <w:rFonts w:hint="eastAsia"/>
+        </w:rPr>
+        <w:lastRenderedPageBreak/>
+        <w:t>fipy_adapter</w:t>
+      </w:r>
+    </w:p>
+    <w:p>
+      <w:pPr>
+        <w:pStyle w:val="4"/>
+      </w:pPr>
+      <w:r>
+        <w:rPr>
+          <w:rFonts w:hint="eastAsia"/>
+        </w:rPr>
+        <w:t>_init_.py</w:t>
+      </w:r>
+    </w:p>
+    <w:p>
+      <w:pPr>
+        <w:pStyle w:val="4"/>
+        <w:rPr>
+          <w:rFonts w:hint="eastAsia"/>
+        </w:rPr>
+      </w:pPr>
+      <w:r>
+        <w:rPr>
+          <w:rFonts w:hint="eastAsia"/>
+        </w:rPr>
+        <w:t>mesh_init.py</w:t>
+      </w:r>
+    </w:p>
+    <w:p>
+      <w:pPr>
+        <w:pStyle w:val="3"/>
+      </w:pPr>
+      <w:r>
+        <w:rPr>
+          <w:rFonts w:hint="eastAsia"/>
+        </w:rPr>
+        <w:t>models</w:t>
+      </w:r>
+    </w:p>
+    <w:p>
+      <w:pPr>
+        <w:pStyle w:val="4"/>
+      </w:pPr>
+      <w:r>
+        <w:rPr>
+          <w:rFonts w:hint="eastAsia"/>
+        </w:rPr>
+        <w:t>slurry_transport</w:t>
+      </w:r>
+    </w:p>
+    <w:p>
+      <w:pPr>
+        <w:pStyle w:val="4"/>
+        <w:rPr>
+          <w:rFonts w:hint="eastAsia"/>
+        </w:rPr>
+      </w:pPr>
+      <w:r>
+        <w:rPr>
+          <w:rFonts w:hint="eastAsia"/>
+        </w:rPr>
+        <w:t>_init_.py</w:t>
+      </w:r>
+    </w:p>
+    <w:p>
+      <w:pPr>
+        <w:pStyle w:val="3"/>
+      </w:pPr>
+      <w:r>
+        <w:rPr>
+          <w:rFonts w:hint="eastAsia"/>
+        </w:rPr>
+        <w:t>pfc_adapter</w:t>
+      </w:r>
+    </w:p>
+    <w:p>
+      <w:pPr>
+        <w:pStyle w:val="4"/>
+      </w:pPr>
+      <w:r>
+        <w:rPr>
+          <w:rFonts w:hint="eastAsia"/>
+        </w:rPr>
+        <w:t>_init_.py</w:t>
+      </w:r>
+    </w:p>
+    <w:p>
+      <w:pPr>
+        <w:pStyle w:val="4"/>
+      </w:pPr>
+      <w:r>
+        <w:rPr>
+          <w:rFonts w:hint="eastAsia"/>
+        </w:rPr>
+        <w:t>partical_writer.py</w:t>
+      </w:r>
+    </w:p>
+    <w:p>
+      <w:pPr>
+        <w:pStyle w:val="4"/>
+        <w:rPr>
+          <w:rFonts w:hint="eastAsia"/>
+        </w:rPr>
+      </w:pPr>
+      <w:r>
+        <w:rPr>
+          <w:rFonts w:hint="eastAsia"/>
+        </w:rPr>
+        <w:t>porosity</w:t>
+      </w:r>
+      <w:r>
+        <w:rPr>
+          <w:rFonts w:hint="eastAsia"/>
+        </w:rPr>
+        <w:t>_reader.py</w:t>
+      </w:r>
+    </w:p>
+    <w:p>
+      <w:pPr>
+        <w:pStyle w:val="3"/>
+      </w:pPr>
+      <w:r>
+        <w:rPr>
+          <w:rFonts w:hint="eastAsia"/>
+        </w:rPr>
+        <w:t>utils</w:t>
+      </w:r>
+    </w:p>
+    <w:p>
+      <w:pPr>
+        <w:pStyle w:val="4"/>
+      </w:pPr>
+      <w:r>
+        <w:rPr>
+          <w:rFonts w:hint="eastAsia"/>
+        </w:rPr>
+        <w:t>_init_.py</w:t>
+      </w:r>
+    </w:p>
+    <w:p>
+      <w:pPr>
+        <w:pStyle w:val="4"/>
+        <w:rPr>
+          <w:rFonts w:hint="eastAsia"/>
+        </w:rPr>
+      </w:pPr>
+      <w:r>
+        <w:rPr>
+          <w:rFonts w:hint="eastAsia"/>
+        </w:rPr>
+        <w:t>README.md</w:t>
+      </w:r>
+    </w:p>
+    <w:p>
+      <w:pPr>
+        <w:pStyle w:val="3"/>
+      </w:pPr>
+      <w:r>
+        <w:rPr>
+          <w:rFonts w:hint="eastAsia"/>
+        </w:rPr>
+        <w:t>_init_.py</w:t>
+      </w:r>
+    </w:p>
+    <w:p>
+      <w:pPr>
+        <w:pStyle w:val="3"/>
+      </w:pPr>
+      <w:r>
+        <w:rPr>
+          <w:rFonts w:hint="eastAsia"/>
+        </w:rPr>
+        <w:t>README.md</w:t>
+      </w:r>
+    </w:p>
+    <w:p>
+      <w:r>
+        <w:rPr>
+          <w:b/>
+          <w:bCs/>
+        </w:rPr>
+        <w:t># src</w:t>
+      </w:r>
+    </w:p>
+    <w:p/>
+    <w:p>
+      <w:r>
+        <w:t>This directory contains new maintainable development code for PFC2D + FiPy coupling.</w:t>
+      </w:r>
+    </w:p>
+    <w:p/>
+    <w:p>
+      <w:r>
+        <w:rPr>
+          <w:b/>
+          <w:bCs/>
+        </w:rPr>
+        <w:t>## Structure</w:t>
+      </w:r>
+    </w:p>
+    <w:p>
+      <w:r>
+        <w:t>- `pfc_adapter/`: PFC-side state extraction and interaction</w:t>
+      </w:r>
+    </w:p>
+    <w:p>
+      <w:r>
+        <w:t>- `fipy_adapter/`: FiPy-side mesh, variables, and solver logic</w:t>
+      </w:r>
+    </w:p>
+    <w:p>
+      <w:r>
+        <w:t>- `coupling/`: variable exchange, timestep control, and coupling driver</w:t>
+      </w:r>
+    </w:p>
+    <w:p>
+      <w:r>
+        <w:t>- `utils/`: shared helper functions</w:t>
+      </w:r>
+    </w:p>
+    <w:p/>
+    <w:p>
+      <w:r>
+        <w:rPr>
+          <w:b/>
+          <w:bCs/>
+        </w:rPr>
+        <w:t>## Rule</w:t>
+      </w:r>
+    </w:p>
+    <w:p>
+      <w:r>
+        <w:t>Do not place raw reference-case code here.</w:t>
+      </w:r>
+    </w:p>
+    <w:p>
+      <w:r>
+        <w:t>Reference cases remain under `reference_cases/`.</w:t>
+      </w:r>
+    </w:p>
+    <w:p>
+      <w:pPr>
+        <w:rPr>
+          <w:rFonts w:hint="eastAsia"/>
+        </w:rPr>
+      </w:pPr>
+    </w:p>
+    <w:p>
+      <w:pPr>
         <w:pStyle w:val="2"/>
         <w:spacing w:before="156" w:after="156"/>
       </w:pPr>
@@ -172,6 +3300,7 @@
         <w:rPr>
           <w:rFonts w:hint="eastAsia"/>
         </w:rPr>
+        <w:lastRenderedPageBreak/>
         <w:t>tests</w:t>
       </w:r>
     </w:p>
@@ -188,12 +3317,274 @@
       </w:r>
     </w:p>
     <w:p>
+      <w:r>
+        <w:rPr>
+          <w:b/>
+          <w:bCs/>
+        </w:rPr>
+        <w:t># Repository rules</w:t>
+      </w:r>
+    </w:p>
+    <w:p/>
+    <w:p>
+      <w:r>
+        <w:rPr>
+          <w:b/>
+          <w:bCs/>
+        </w:rPr>
+        <w:t>## Scope</w:t>
+      </w:r>
+    </w:p>
+    <w:p>
+      <w:r>
+        <w:t>- This repository is for PFC2D + FiPy coupling development.</w:t>
+      </w:r>
+    </w:p>
+    <w:p>
+      <w:r>
+        <w:t>- Files under `reference_cases/` are reference-only unless explicitly asked to modify them.</w:t>
+      </w:r>
+    </w:p>
+    <w:p>
+      <w:r>
+        <w:t>- Prefer minimal diffs over broad refactors.</w:t>
+      </w:r>
+    </w:p>
+    <w:p>
+      <w:r>
+        <w:t>- Preserve original execution order for reference cases.</w:t>
+      </w:r>
+    </w:p>
+    <w:p/>
+    <w:p>
+      <w:r>
+        <w:rPr>
+          <w:b/>
+          <w:bCs/>
+        </w:rPr>
+        <w:t>## Reference cases</w:t>
+      </w:r>
+    </w:p>
+    <w:p>
+      <w:r>
+        <w:t>- Treat Word-derived cases as archival references first, not production code.</w:t>
+      </w:r>
+    </w:p>
+    <w:p>
+      <w:r>
+        <w:t>- Do not rewrite reference cases into a new architecture unless explicitly requested.</w:t>
+      </w:r>
+    </w:p>
+    <w:p>
+      <w:r>
+        <w:t>- When analyzing a reference case, explain the execution chain before proposing changes.</w:t>
+      </w:r>
+    </w:p>
+    <w:p/>
+    <w:p>
+      <w:r>
+        <w:rPr>
+          <w:b/>
+          <w:bCs/>
+        </w:rPr>
+        <w:t>## Development rules</w:t>
+      </w:r>
+    </w:p>
+    <w:p>
+      <w:r>
+        <w:t>- New maintainable code should go under `src/`.</w:t>
+      </w:r>
+    </w:p>
+    <w:p>
+      <w:r>
+        <w:t>- Do not mix new development code into `reference_cases/`.</w:t>
+      </w:r>
+    </w:p>
+    <w:p>
+      <w:r>
+        <w:t>- Separate PFC-side scripts, FiPy-side scripts, and coupling logic whenever possible.</w:t>
+      </w:r>
+    </w:p>
+    <w:p>
+      <w:r>
+        <w:t>- Keep variable mapping and time-stepping logic explicit.</w:t>
+      </w:r>
+    </w:p>
+    <w:p/>
+    <w:p>
+      <w:r>
+        <w:rPr>
+          <w:b/>
+          <w:bCs/>
+        </w:rPr>
+        <w:t>## High-risk changes</w:t>
+      </w:r>
+    </w:p>
+    <w:p>
+      <w:r>
+        <w:t>Ask before changing:</w:t>
+      </w:r>
+    </w:p>
+    <w:p>
+      <w:r>
+        <w:t>- time stepping logic</w:t>
+      </w:r>
+    </w:p>
+    <w:p>
+      <w:r>
+        <w:t>- convergence criteria</w:t>
+      </w:r>
+    </w:p>
+    <w:p>
+      <w:r>
+        <w:t>- boundary conditions</w:t>
+      </w:r>
+    </w:p>
+    <w:p>
+      <w:r>
+        <w:t>- particle-mesh mapping rules</w:t>
+      </w:r>
+    </w:p>
+    <w:p>
+      <w:r>
+        <w:t>- unit conversion assumptions</w:t>
+      </w:r>
+    </w:p>
+    <w:p/>
+    <w:p>
+      <w:r>
+        <w:rPr>
+          <w:b/>
+          <w:bCs/>
+        </w:rPr>
+        <w:t>## Validation</w:t>
+      </w:r>
+    </w:p>
+    <w:p>
+      <w:r>
+        <w:t>- After edits, explain what changed.</w:t>
+      </w:r>
+    </w:p>
+    <w:p>
+      <w:r>
+        <w:t>- Prefer checking one small runnable path before larger refactors.</w:t>
+      </w:r>
+    </w:p>
+    <w:p>
+      <w:r>
+        <w:t>- When something cannot be validated, state exactly what is missing.</w:t>
+      </w:r>
+    </w:p>
+    <w:p/>
+    <w:p>
+      <w:r>
+        <w:rPr>
+          <w:b/>
+          <w:bCs/>
+        </w:rPr>
+        <w:t>## Notes for this repository</w:t>
+      </w:r>
+    </w:p>
+    <w:p>
+      <w:r>
+        <w:t>- The rainfall infiltration 2D case is currently a faithful split from Word.</w:t>
+      </w:r>
+    </w:p>
+    <w:p>
+      <w:r>
+        <w:t>- Python files in that case may share runtime context and should not be modularized prematurely.</w:t>
+      </w:r>
+    </w:p>
+    <w:p/>
+    <w:p>
+      <w:r>
+        <w:lastRenderedPageBreak/>
+        <w:t>- The particle skeleton is rigid; do not add fluid-driven particle deformation.</w:t>
+      </w:r>
+    </w:p>
+    <w:p>
+      <w:r>
+        <w:t>- Porosity is transferred only once at initialization; do not add later porosity updates.</w:t>
+      </w:r>
+    </w:p>
+    <w:p>
+      <w:r>
+        <w:t>- The particle model is fixed; do not add automatic particle-model adaptation unless explicitly requested.</w:t>
+      </w:r>
+    </w:p>
+    <w:p/>
+    <w:p>
+      <w:r>
+        <w:rPr>
+          <w:b/>
+          <w:bCs/>
+        </w:rPr>
+        <w:t>## Modeling constraints for code generation</w:t>
+      </w:r>
+    </w:p>
+    <w:p/>
+    <w:p>
+      <w:r>
+        <w:t>When modifying this repository, keep the following assumptions unless the user explicitly changes them:</w:t>
+      </w:r>
+    </w:p>
+    <w:p/>
+    <w:p>
+      <w:r>
+        <w:t>- Treat the waste-rock skeleton as fixed.</w:t>
+      </w:r>
+    </w:p>
+    <w:p>
+      <w:r>
+        <w:t>- Do not introduce fluid-driven particle motion.</w:t>
+      </w:r>
+    </w:p>
+    <w:p>
+      <w:r>
+        <w:t>- Do not update porosity dynamically after initialization.</w:t>
+      </w:r>
+    </w:p>
+    <w:p>
+      <w:r>
+        <w:t>- Treat the slurry transport process as variable-saturation continuum transport.</w:t>
+      </w:r>
+    </w:p>
+    <w:p>
+      <w:r>
+        <w:t>- Use a generalized nonlinear Darcy-type framework rather than a simple saturated linear Darcy law.</w:t>
+      </w:r>
+    </w:p>
+    <w:p>
+      <w:r>
+        <w:t>- Do not automatically switch to a standard Richards–van Genuchten soil-water model.</w:t>
+      </w:r>
+    </w:p>
+    <w:p>
+      <w:r>
+        <w:t>- Consider Bingham-type slurry behavior in the first-version baseline.</w:t>
+      </w:r>
+    </w:p>
+    <w:p>
+      <w:r>
+        <w:t>- Keep clogging disabled in the first-version baseline unless explicitly requested.</w:t>
+      </w:r>
+    </w:p>
+    <w:p>
+      <w:r>
+        <w:t>- Preserve clean extension points for future rheology, clogging, or dynamic porosity upgrades.</w:t>
+      </w:r>
+    </w:p>
+    <w:p>
+      <w:pPr>
+        <w:rPr>
+          <w:rFonts w:hint="eastAsia"/>
+        </w:rPr>
+      </w:pPr>
+    </w:p>
+    <w:p>
       <w:pPr>
         <w:pStyle w:val="2"/>
         <w:spacing w:before="156" w:after="156"/>
-        <w:rPr>
-          <w:rFonts w:hint="eastAsia"/>
-        </w:rPr>
       </w:pPr>
       <w:r>
         <w:rPr>
@@ -201,6 +3592,300 @@
         </w:rPr>
         <w:t>README.md</w:t>
       </w:r>
+    </w:p>
+    <w:p>
+      <w:r>
+        <w:rPr>
+          <w:b/>
+          <w:bCs/>
+        </w:rPr>
+        <w:t># PFC2D + FiPy Coupling for Waste-Rock Slurry Transport</w:t>
+      </w:r>
+    </w:p>
+    <w:p/>
+    <w:p>
+      <w:r>
+        <w:t>This repository develops a coupled PFC2D + FiPy workflow for engineering-scale slurry transport in a fixed waste-rock pile, with application to underground mine grouting/backfilling scenarios.</w:t>
+      </w:r>
+    </w:p>
+    <w:p/>
+    <w:p>
+      <w:r>
+        <w:rPr>
+          <w:b/>
+          <w:bCs/>
+        </w:rPr>
+        <w:t>## Project goal</w:t>
+      </w:r>
+    </w:p>
+    <w:p/>
+    <w:p>
+      <w:r>
+        <w:t>The target problem is local slurry pouring on the top of a waste-rock pile and the subsequent migration of slurry through the pile.</w:t>
+      </w:r>
+    </w:p>
+    <w:p/>
+    <w:p>
+      <w:r>
+        <w:t xml:space="preserve">The final objective is </w:t>
+      </w:r>
+      <w:r>
+        <w:rPr>
+          <w:b/>
+          <w:bCs/>
+        </w:rPr>
+        <w:t>**not**</w:t>
+      </w:r>
+      <w:r>
+        <w:t xml:space="preserve"> to directly copy a rainfall infiltration case. Instead, this project builds a dedicated slurry-transport model with the following role split:</w:t>
+      </w:r>
+    </w:p>
+    <w:p/>
+    <w:p>
+      <w:r>
+        <w:t xml:space="preserve">- </w:t>
+      </w:r>
+      <w:r>
+        <w:rPr>
+          <w:b/>
+          <w:bCs/>
+        </w:rPr>
+        <w:t>**PFC2D**</w:t>
+      </w:r>
+      <w:r>
+        <w:t xml:space="preserve"> provides waste-rock structure and porosity-related information.</w:t>
+      </w:r>
+    </w:p>
+    <w:p>
+      <w:r>
+        <w:t xml:space="preserve">- </w:t>
+      </w:r>
+      <w:r>
+        <w:rPr>
+          <w:b/>
+          <w:bCs/>
+        </w:rPr>
+        <w:t>**FiPy**</w:t>
+      </w:r>
+      <w:r>
+        <w:t xml:space="preserve"> solves the continuum-scale fluid field.</w:t>
+      </w:r>
+    </w:p>
+    <w:p>
+      <w:r>
+        <w:t>- Fluid results may be written back to particle extra variables for visualization and statistics.</w:t>
+      </w:r>
+    </w:p>
+    <w:p/>
+    <w:p>
+      <w:r>
+        <w:rPr>
+          <w:b/>
+          <w:bCs/>
+        </w:rPr>
+        <w:lastRenderedPageBreak/>
+        <w:t>## Current first-version modeling assumptions</w:t>
+      </w:r>
+    </w:p>
+    <w:p/>
+    <w:p>
+      <w:r>
+        <w:t>The current baseline model uses the following assumptions:</w:t>
+      </w:r>
+    </w:p>
+    <w:p/>
+    <w:p>
+      <w:r>
+        <w:t>- The waste-rock skeleton is fixed and does not deform under fluid action.</w:t>
+      </w:r>
+    </w:p>
+    <w:p>
+      <w:r>
+        <w:t>- Porosity is transferred from PFC to FiPy only once at initialization.</w:t>
+      </w:r>
+    </w:p>
+    <w:p>
+      <w:r>
+        <w:t xml:space="preserve">- The process is treated as </w:t>
+      </w:r>
+      <w:r>
+        <w:rPr>
+          <w:b/>
+          <w:bCs/>
+        </w:rPr>
+        <w:t>**variable-saturation slurry migration**</w:t>
+      </w:r>
+      <w:r>
+        <w:t>, not as a fully saturated seepage problem.</w:t>
+      </w:r>
+    </w:p>
+    <w:p>
+      <w:r>
+        <w:t xml:space="preserve">- The continuum formulation is a </w:t>
+      </w:r>
+      <w:r>
+        <w:rPr>
+          <w:b/>
+          <w:bCs/>
+        </w:rPr>
+        <w:t>**generalized nonlinear Darcy-type model**</w:t>
+      </w:r>
+      <w:r>
+        <w:t xml:space="preserve"> rather than a simple saturated linear Darcy law.</w:t>
+      </w:r>
+    </w:p>
+    <w:p>
+      <w:r>
+        <w:t xml:space="preserve">- Slurry rheology should account for </w:t>
+      </w:r>
+      <w:r>
+        <w:rPr>
+          <w:b/>
+          <w:bCs/>
+        </w:rPr>
+        <w:t>**Bingham-type yield behavior**</w:t>
+      </w:r>
+      <w:r>
+        <w:t xml:space="preserve"> in the first version.</w:t>
+      </w:r>
+    </w:p>
+    <w:p>
+      <w:r>
+        <w:t xml:space="preserve">- </w:t>
+      </w:r>
+      <w:r>
+        <w:rPr>
+          <w:b/>
+          <w:bCs/>
+        </w:rPr>
+        <w:t>**Clogging is neglected**</w:t>
+      </w:r>
+      <w:r>
+        <w:t xml:space="preserve"> in the current baseline because the waste-rock structure is assumed to be relatively coarse.</w:t>
+      </w:r>
+    </w:p>
+    <w:p>
+      <w:r>
+        <w:t xml:space="preserve">- The model does </w:t>
+      </w:r>
+      <w:r>
+        <w:rPr>
+          <w:b/>
+          <w:bCs/>
+        </w:rPr>
+        <w:t>**not**</w:t>
+      </w:r>
+      <w:r>
+        <w:t xml:space="preserve"> directly adopt the standard Richards–van Genuchten soil-water formulation unless explicitly re-evaluated later.</w:t>
+      </w:r>
+    </w:p>
+    <w:p/>
+    <w:p>
+      <w:r>
+        <w:rPr>
+          <w:b/>
+          <w:bCs/>
+        </w:rPr>
+        <w:t>## Repository intent</w:t>
+      </w:r>
+    </w:p>
+    <w:p/>
+    <w:p>
+      <w:r>
+        <w:t xml:space="preserve">This repository prioritizes a </w:t>
+      </w:r>
+      <w:r>
+        <w:rPr>
+          <w:b/>
+          <w:bCs/>
+        </w:rPr>
+        <w:t>**minimal, verifiable first version**</w:t>
+      </w:r>
+      <w:r>
+        <w:t xml:space="preserve"> before introducing more complex mechanisms such as clogging, dynamic porosity update, skeleton deformation, or more advanced rheology.</w:t>
+      </w:r>
+    </w:p>
+    <w:p/>
+    <w:p>
+      <w:r>
+        <w:rPr>
+          <w:b/>
+          <w:bCs/>
+        </w:rPr>
+        <w:t>## Documentation</w:t>
+      </w:r>
+    </w:p>
+    <w:p/>
+    <w:p>
+      <w:r>
+        <w:t>Detailed physical assumptions and modeling scope are described in:</w:t>
+      </w:r>
+    </w:p>
+    <w:p/>
+    <w:p>
+      <w:r>
+        <w:t>- `docs/physical_model.md`</w:t>
+      </w:r>
+    </w:p>
+    <w:p/>
+    <w:p>
+      <w:r>
+        <w:rPr>
+          <w:b/>
+          <w:bCs/>
+        </w:rPr>
+        <w:t>## Current design principles</w:t>
+      </w:r>
+    </w:p>
+    <w:p/>
+    <w:p>
+      <w:r>
+        <w:t>Implementation work in this repository should follow these principles:</w:t>
+      </w:r>
+    </w:p>
+    <w:p/>
+    <w:p>
+      <w:r>
+        <w:t>- keep the PFC side focused on geometry / porosity export,</w:t>
+      </w:r>
+    </w:p>
+    <w:p>
+      <w:r>
+        <w:t>- keep the FiPy side focused on continuum field solving,</w:t>
+      </w:r>
+    </w:p>
+    <w:p>
+      <w:r>
+        <w:t>- avoid silently switching back to classical saturated water-infiltration assumptions,</w:t>
+      </w:r>
+    </w:p>
+    <w:p>
+      <w:r>
+        <w:t>- preserve clean extension points for future upgrades.</w:t>
+      </w:r>
+    </w:p>
+    <w:p/>
+    <w:p>
+      <w:r>
+        <w:rPr>
+          <w:b/>
+          <w:bCs/>
+        </w:rPr>
+        <w:t>## Status</w:t>
+      </w:r>
+    </w:p>
+    <w:p/>
+    <w:p>
+      <w:r>
+        <w:t>This repository is under iterative development. The current model description is a working baseline for implementation and validation, not a final claim that the physical model is complete.</w:t>
+      </w:r>
+    </w:p>
+    <w:p>
+      <w:pPr>
+        <w:rPr>
+          <w:rFonts w:hint="eastAsia"/>
+        </w:rPr>
+      </w:pPr>
     </w:p>
     <w:sectPr>
       <w:pgSz w:w="11906" w:h="16838"/>
@@ -210,6 +3895,44 @@
     </w:sectPr>
   </w:body>
 </w:document>
+</file>
+
+<file path=word/endnotes.xml><?xml version="1.0" encoding="utf-8"?>
+<w:endnotes xmlns:wpc="http://schemas.microsoft.com/office/word/2010/wordprocessingCanvas" xmlns:cx="http://schemas.microsoft.com/office/drawing/2014/chartex" xmlns:cx1="http://schemas.microsoft.com/office/drawing/2015/9/8/chartex" xmlns:cx2="http://schemas.microsoft.com/office/drawing/2015/10/21/chartex" xmlns:cx3="http://schemas.microsoft.com/office/drawing/2016/5/9/chartex" xmlns:cx4="http://schemas.microsoft.com/office/drawing/2016/5/10/chartex" xmlns:cx5="http://schemas.microsoft.com/office/drawing/2016/5/11/chartex" xmlns:cx6="http://schemas.microsoft.com/office/drawing/2016/5/12/chartex" xmlns:cx7="http://schemas.microsoft.com/office/drawing/2016/5/13/chartex" xmlns:cx8="http://schemas.microsoft.com/office/drawing/2016/5/14/chartex" xmlns:mc="http://schemas.openxmlformats.org/markup-compatibility/2006" xmlns:aink="http://schemas.microsoft.com/office/drawing/2016/ink" xmlns:am3d="http://schemas.microsoft.com/office/drawing/2017/model3d" xmlns:o="urn:schemas-microsoft-com:office:office" xmlns:oel="http://schemas.microsoft.com/office/2019/extlst" xmlns:r="http://schemas.openxmlformats.org/officeDocument/2006/relationships" xmlns:m="http://schemas.openxmlformats.org/officeDocument/2006/math" xmlns:v="urn:schemas-microsoft-com:vml" xmlns:wp14="http://schemas.microsoft.com/office/word/2010/wordprocessingDrawing" xmlns:wp="http://schemas.openxmlformats.org/drawingml/2006/wordprocessingDrawing" xmlns:w10="urn:schemas-microsoft-com:office:word" xmlns:w="http://schemas.openxmlformats.org/wordprocessingml/2006/main" xmlns:w14="http://schemas.microsoft.com/office/word/2010/wordml" xmlns:w15="http://schemas.microsoft.com/office/word/2012/wordml" xmlns:w16cex="http://schemas.microsoft.com/office/word/2018/wordml/cex" xmlns:w16cid="http://schemas.microsoft.com/office/word/2016/wordml/cid" xmlns:w16="http://schemas.microsoft.com/office/word/2018/wordml" xmlns:w16du="http://schemas.microsoft.com/office/word/2023/wordml/word16du" xmlns:w16sdtdh="http://schemas.microsoft.com/office/word/2020/wordml/sdtdatahash" xmlns:w16sdtfl="http://schemas.microsoft.com/office/word/2024/wordml/sdtformatlock" xmlns:w16se="http://schemas.microsoft.com/office/word/2015/wordml/symex" xmlns:wpg="http://schemas.microsoft.com/office/word/2010/wordprocessingGroup" xmlns:wpi="http://schemas.microsoft.com/office/word/2010/wordprocessingInk" xmlns:wne="http://schemas.microsoft.com/office/word/2006/wordml" xmlns:wps="http://schemas.microsoft.com/office/word/2010/wordprocessingShape" mc:Ignorable="w14 w15 w16se w16cid w16 w16cex w16sdtdh w16sdtfl w16du wp14">
+  <w:endnote w:type="separator" w:id="-1">
+    <w:p>
+      <w:r>
+        <w:separator/>
+      </w:r>
+    </w:p>
+  </w:endnote>
+  <w:endnote w:type="continuationSeparator" w:id="0">
+    <w:p>
+      <w:r>
+        <w:continuationSeparator/>
+      </w:r>
+    </w:p>
+  </w:endnote>
+</w:endnotes>
+</file>
+
+<file path=word/footnotes.xml><?xml version="1.0" encoding="utf-8"?>
+<w:footnotes xmlns:wpc="http://schemas.microsoft.com/office/word/2010/wordprocessingCanvas" xmlns:cx="http://schemas.microsoft.com/office/drawing/2014/chartex" xmlns:cx1="http://schemas.microsoft.com/office/drawing/2015/9/8/chartex" xmlns:cx2="http://schemas.microsoft.com/office/drawing/2015/10/21/chartex" xmlns:cx3="http://schemas.microsoft.com/office/drawing/2016/5/9/chartex" xmlns:cx4="http://schemas.microsoft.com/office/drawing/2016/5/10/chartex" xmlns:cx5="http://schemas.microsoft.com/office/drawing/2016/5/11/chartex" xmlns:cx6="http://schemas.microsoft.com/office/drawing/2016/5/12/chartex" xmlns:cx7="http://schemas.microsoft.com/office/drawing/2016/5/13/chartex" xmlns:cx8="http://schemas.microsoft.com/office/drawing/2016/5/14/chartex" xmlns:mc="http://schemas.openxmlformats.org/markup-compatibility/2006" xmlns:aink="http://schemas.microsoft.com/office/drawing/2016/ink" xmlns:am3d="http://schemas.microsoft.com/office/drawing/2017/model3d" xmlns:o="urn:schemas-microsoft-com:office:office" xmlns:oel="http://schemas.microsoft.com/office/2019/extlst" xmlns:r="http://schemas.openxmlformats.org/officeDocument/2006/relationships" xmlns:m="http://schemas.openxmlformats.org/officeDocument/2006/math" xmlns:v="urn:schemas-microsoft-com:vml" xmlns:wp14="http://schemas.microsoft.com/office/word/2010/wordprocessingDrawing" xmlns:wp="http://schemas.openxmlformats.org/drawingml/2006/wordprocessingDrawing" xmlns:w10="urn:schemas-microsoft-com:office:word" xmlns:w="http://schemas.openxmlformats.org/wordprocessingml/2006/main" xmlns:w14="http://schemas.microsoft.com/office/word/2010/wordml" xmlns:w15="http://schemas.microsoft.com/office/word/2012/wordml" xmlns:w16cex="http://schemas.microsoft.com/office/word/2018/wordml/cex" xmlns:w16cid="http://schemas.microsoft.com/office/word/2016/wordml/cid" xmlns:w16="http://schemas.microsoft.com/office/word/2018/wordml" xmlns:w16du="http://schemas.microsoft.com/office/word/2023/wordml/word16du" xmlns:w16sdtdh="http://schemas.microsoft.com/office/word/2020/wordml/sdtdatahash" xmlns:w16sdtfl="http://schemas.microsoft.com/office/word/2024/wordml/sdtformatlock" xmlns:w16se="http://schemas.microsoft.com/office/word/2015/wordml/symex" xmlns:wpg="http://schemas.microsoft.com/office/word/2010/wordprocessingGroup" xmlns:wpi="http://schemas.microsoft.com/office/word/2010/wordprocessingInk" xmlns:wne="http://schemas.microsoft.com/office/word/2006/wordml" xmlns:wps="http://schemas.microsoft.com/office/word/2010/wordprocessingShape" mc:Ignorable="w14 w15 w16se w16cid w16 w16cex w16sdtdh w16sdtfl w16du wp14">
+  <w:footnote w:type="separator" w:id="-1">
+    <w:p>
+      <w:r>
+        <w:separator/>
+      </w:r>
+    </w:p>
+  </w:footnote>
+  <w:footnote w:type="continuationSeparator" w:id="0">
+    <w:p>
+      <w:r>
+        <w:continuationSeparator/>
+      </w:r>
+    </w:p>
+  </w:footnote>
+</w:footnotes>
 </file>
 
 <file path=word/styles.xml><?xml version="1.0" encoding="utf-8"?>
@@ -692,7 +4415,6 @@
     <w:next w:val="a"/>
     <w:link w:val="40"/>
     <w:uiPriority w:val="9"/>
-    <w:semiHidden/>
     <w:unhideWhenUsed/>
     <w:qFormat/>
     <w:rsid w:val="00457F2B"/>
@@ -715,7 +4437,6 @@
     <w:next w:val="a"/>
     <w:link w:val="50"/>
     <w:uiPriority w:val="9"/>
-    <w:semiHidden/>
     <w:unhideWhenUsed/>
     <w:qFormat/>
     <w:rsid w:val="00457F2B"/>
@@ -819,7 +4540,6 @@
   <w:style w:type="character" w:default="1" w:styleId="a0">
     <w:name w:val="Default Paragraph Font"/>
     <w:uiPriority w:val="1"/>
-    <w:semiHidden/>
     <w:unhideWhenUsed/>
   </w:style>
   <w:style w:type="table" w:default="1" w:styleId="a1">
@@ -944,7 +4664,6 @@
     <w:basedOn w:val="a0"/>
     <w:link w:val="4"/>
     <w:uiPriority w:val="9"/>
-    <w:semiHidden/>
     <w:rsid w:val="00457F2B"/>
     <w:rPr>
       <w:rFonts w:cstheme="majorBidi"/>
@@ -959,7 +4678,6 @@
     <w:basedOn w:val="a0"/>
     <w:link w:val="5"/>
     <w:uiPriority w:val="9"/>
-    <w:semiHidden/>
     <w:rsid w:val="00457F2B"/>
     <w:rPr>
       <w:rFonts w:cstheme="majorBidi"/>
@@ -1215,6 +4933,72 @@
       <w:smallCaps/>
       <w:color w:val="0F4761" w:themeColor="accent1" w:themeShade="BF"/>
       <w:spacing w:val="5"/>
+    </w:rPr>
+  </w:style>
+  <w:style w:type="paragraph" w:styleId="af0">
+    <w:name w:val="header"/>
+    <w:basedOn w:val="a"/>
+    <w:link w:val="af1"/>
+    <w:uiPriority w:val="99"/>
+    <w:unhideWhenUsed/>
+    <w:rsid w:val="00573D09"/>
+    <w:pPr>
+      <w:tabs>
+        <w:tab w:val="center" w:pos="4153"/>
+        <w:tab w:val="right" w:pos="8306"/>
+      </w:tabs>
+      <w:snapToGrid w:val="0"/>
+      <w:jc w:val="center"/>
+    </w:pPr>
+    <w:rPr>
+      <w:sz w:val="18"/>
+      <w:szCs w:val="18"/>
+    </w:rPr>
+  </w:style>
+  <w:style w:type="character" w:customStyle="1" w:styleId="af1">
+    <w:name w:val="页眉 字符"/>
+    <w:basedOn w:val="a0"/>
+    <w:link w:val="af0"/>
+    <w:uiPriority w:val="99"/>
+    <w:rsid w:val="00573D09"/>
+    <w:rPr>
+      <w:rFonts w:ascii="Times New Roman" w:eastAsia="宋体" w:hAnsi="Times New Roman" w:cs="Times New Roman"/>
+      <w:sz w:val="18"/>
+      <w:szCs w:val="18"/>
+      <w14:ligatures w14:val="none"/>
+    </w:rPr>
+  </w:style>
+  <w:style w:type="paragraph" w:styleId="af2">
+    <w:name w:val="footer"/>
+    <w:basedOn w:val="a"/>
+    <w:link w:val="af3"/>
+    <w:uiPriority w:val="99"/>
+    <w:unhideWhenUsed/>
+    <w:rsid w:val="00573D09"/>
+    <w:pPr>
+      <w:tabs>
+        <w:tab w:val="center" w:pos="4153"/>
+        <w:tab w:val="right" w:pos="8306"/>
+      </w:tabs>
+      <w:snapToGrid w:val="0"/>
+      <w:jc w:val="left"/>
+    </w:pPr>
+    <w:rPr>
+      <w:sz w:val="18"/>
+      <w:szCs w:val="18"/>
+    </w:rPr>
+  </w:style>
+  <w:style w:type="character" w:customStyle="1" w:styleId="af3">
+    <w:name w:val="页脚 字符"/>
+    <w:basedOn w:val="a0"/>
+    <w:link w:val="af2"/>
+    <w:uiPriority w:val="99"/>
+    <w:rsid w:val="00573D09"/>
+    <w:rPr>
+      <w:rFonts w:ascii="Times New Roman" w:eastAsia="宋体" w:hAnsi="Times New Roman" w:cs="Times New Roman"/>
+      <w:sz w:val="18"/>
+      <w:szCs w:val="18"/>
+      <w14:ligatures w14:val="none"/>
     </w:rPr>
   </w:style>
 </w:styles>

</xml_diff>